<commit_message>
Scadenzario, Stampa consulente del lavoro, ReportTLTime, Statistiche Costi: possibilità di effettuare ricerche selezionando esclusivamente l’anno
</commit_message>
<xml_diff>
--- a/VideoSystemWeb/DOCUMENTI/HELP/HELP VIDEOSYSTEM.docx
+++ b/VideoSystemWeb/DOCUMENTI/HELP/HELP VIDEOSYSTEM.docx
@@ -15,22 +15,16 @@
         <w:t>Versione 2.1.</w:t>
       </w:r>
       <w:r>
-        <w:t>4</w:t>
+        <w:t>5</w:t>
       </w:r>
       <w:r>
         <w:t xml:space="preserve"> del </w:t>
       </w:r>
       <w:r>
-        <w:t>10</w:t>
-      </w:r>
-      <w:r>
-        <w:t>/</w:t>
-      </w:r>
-      <w:r>
-        <w:t>10</w:t>
-      </w:r>
-      <w:r>
-        <w:t>/2026</w:t>
+        <w:t>24</w:t>
+      </w:r>
+      <w:r>
+        <w:t>/10/2026</w:t>
       </w:r>
     </w:p>
     <w:p>
@@ -42,10 +36,24 @@
         </w:numPr>
       </w:pPr>
       <w:r>
-        <w:t xml:space="preserve">Scadenzario: ordinamento </w:t>
-      </w:r>
-      <w:r>
-        <w:t>decrescente per ogni stato di pagamento</w:t>
+        <w:t>Scadenzario</w:t>
+      </w:r>
+      <w:r>
+        <w:t xml:space="preserve">, Stampa consulente del lavoro, </w:t>
+      </w:r>
+      <w:proofErr w:type="spellStart"/>
+      <w:r>
+        <w:t>ReportTLTime</w:t>
+      </w:r>
+      <w:proofErr w:type="spellEnd"/>
+      <w:r>
+        <w:t>, Statistiche Costi</w:t>
+      </w:r>
+      <w:r>
+        <w:t xml:space="preserve">: </w:t>
+      </w:r>
+      <w:r>
+        <w:t>possibilità di effettuare ricerche selezionando esclusivamente l’anno</w:t>
       </w:r>
     </w:p>
     <w:p>
@@ -53,6 +61,26 @@
         <w:pStyle w:val="Sottotitolo"/>
       </w:pPr>
       <w:r>
+        <w:t>Versione 2.1.4 del 10/10/2026</w:t>
+      </w:r>
+    </w:p>
+    <w:p>
+      <w:pPr>
+        <w:pStyle w:val="Paragrafoelenco"/>
+        <w:numPr>
+          <w:ilvl w:val="0"/>
+          <w:numId w:val="66"/>
+        </w:numPr>
+      </w:pPr>
+      <w:r>
+        <w:t>Scadenzario: ordinamento decrescente per ogni stato di pagamento</w:t>
+      </w:r>
+    </w:p>
+    <w:p>
+      <w:pPr>
+        <w:pStyle w:val="Sottotitolo"/>
+      </w:pPr>
+      <w:r>
         <w:t>Versione 2.1.3 del 03/10/2026</w:t>
       </w:r>
     </w:p>
@@ -348,6 +376,7 @@
         </w:numPr>
       </w:pPr>
       <w:r>
+        <w:lastRenderedPageBreak/>
         <w:t>14/06/2026 Stampa Consulente del lavoro: nuovi filtri di ricerca</w:t>
       </w:r>
     </w:p>
@@ -392,16 +421,475 @@
         </w:numPr>
       </w:pPr>
       <w:r>
+        <w:t xml:space="preserve">20/05/2026 Rimborso km: impostato importo lordo uguale al netto; Figure professionali: esclusi dalla ricerca i collaboratori non attivi; validazione specifica per CF; Report Consulente Lavoro: quota mista nella query letta dalla tabella di </w:t>
+      </w:r>
+      <w:proofErr w:type="spellStart"/>
+      <w:r>
+        <w:t>config</w:t>
+      </w:r>
+      <w:proofErr w:type="spellEnd"/>
+      <w:r>
+        <w:t>; aggiunto conteggio collaboratori estratti; Scadenzario: aggiunto filtro mese/anno per impostare ricerca più velocemente</w:t>
+      </w:r>
+    </w:p>
+    <w:p>
+      <w:pPr>
+        <w:pStyle w:val="Paragrafoelenco"/>
+        <w:numPr>
+          <w:ilvl w:val="0"/>
+          <w:numId w:val="66"/>
+        </w:numPr>
+      </w:pPr>
+      <w:r>
+        <w:t>16/05/2026 Stampa Collaboratori: sezione eliminata (disabilitata) Stampa Consulente del lavoro: Rinominato in Stampa Collaboratori; Visualizzazioni dettagliata e sintetica; Riorganizzazione delle colonne; Pulsante stampa nascosto; Nuovo filtro tempo determinato/indeterminato; Nome lavorazione spostato nel riepilogo; Filtro Nominativo spostato come prima voce Scadenzario: Nuovo filtro lavorazione (aggiunta anche colonna in griglia risultati)</w:t>
+      </w:r>
+    </w:p>
+    <w:p>
+      <w:pPr>
+        <w:pStyle w:val="Paragrafoelenco"/>
+        <w:numPr>
+          <w:ilvl w:val="0"/>
+          <w:numId w:val="66"/>
+        </w:numPr>
+      </w:pPr>
+      <w:r>
+        <w:t xml:space="preserve">05/05/2026 Statistiche ricavi: </w:t>
+      </w:r>
+      <w:proofErr w:type="spellStart"/>
+      <w:r>
+        <w:t>bugfix</w:t>
+      </w:r>
+      <w:proofErr w:type="spellEnd"/>
+      <w:r>
+        <w:t xml:space="preserve"> query; Anagrafica collaboratori: </w:t>
+      </w:r>
+      <w:proofErr w:type="spellStart"/>
+      <w:r>
+        <w:t>bugfix</w:t>
+      </w:r>
+      <w:proofErr w:type="spellEnd"/>
+      <w:r>
+        <w:t xml:space="preserve"> inserimento telefono</w:t>
+      </w:r>
+    </w:p>
+    <w:p>
+      <w:pPr>
+        <w:pStyle w:val="Paragrafoelenco"/>
+        <w:numPr>
+          <w:ilvl w:val="0"/>
+          <w:numId w:val="66"/>
+        </w:numPr>
+      </w:pPr>
+      <w:r>
+        <w:t xml:space="preserve">04/05/2026 Anagrafica collaboratori: campi obbligatori; Lavorazione: sostituita voce 'Rimborso km' con 'Mista'; Stampa consulente del lavoro: prime modifiche per nuovi filtri (non terminata); </w:t>
+      </w:r>
+      <w:proofErr w:type="spellStart"/>
+      <w:r>
+        <w:t>bugfix</w:t>
+      </w:r>
+      <w:proofErr w:type="spellEnd"/>
+    </w:p>
+    <w:p>
+      <w:pPr>
+        <w:pStyle w:val="Paragrafoelenco"/>
+        <w:numPr>
+          <w:ilvl w:val="0"/>
+          <w:numId w:val="66"/>
+        </w:numPr>
+      </w:pPr>
+      <w:r>
+        <w:t xml:space="preserve">24/04/2026 Statistiche Costi: link alla lavorazione, filtro mese ed anno, descrizione lavorazione nell'intestazione, </w:t>
+      </w:r>
+      <w:proofErr w:type="spellStart"/>
+      <w:r>
+        <w:t>bugfix</w:t>
+      </w:r>
+      <w:proofErr w:type="spellEnd"/>
+    </w:p>
+    <w:p>
+      <w:pPr>
+        <w:pStyle w:val="Paragrafoelenco"/>
+        <w:numPr>
+          <w:ilvl w:val="0"/>
+          <w:numId w:val="66"/>
+        </w:numPr>
+      </w:pPr>
+      <w:r>
+        <w:t xml:space="preserve">21/04/2026 Statistiche Costi: </w:t>
+      </w:r>
+      <w:proofErr w:type="spellStart"/>
+      <w:r>
+        <w:t>Bugfix</w:t>
+      </w:r>
+      <w:proofErr w:type="spellEnd"/>
+      <w:r>
+        <w:t xml:space="preserve"> ricerca e popolamento tendina sottogruppo</w:t>
+      </w:r>
+    </w:p>
+    <w:p>
+      <w:pPr>
+        <w:pStyle w:val="Paragrafoelenco"/>
+        <w:numPr>
+          <w:ilvl w:val="0"/>
+          <w:numId w:val="66"/>
+        </w:numPr>
+      </w:pPr>
+      <w:r>
+        <w:t xml:space="preserve">14/04/2026 </w:t>
+      </w:r>
+      <w:proofErr w:type="spellStart"/>
+      <w:r>
+        <w:t>Bugfix</w:t>
+      </w:r>
+      <w:proofErr w:type="spellEnd"/>
+      <w:r>
+        <w:t xml:space="preserve"> Statistiche Costi</w:t>
+      </w:r>
+    </w:p>
+    <w:p>
+      <w:pPr>
+        <w:pStyle w:val="Paragrafoelenco"/>
+        <w:numPr>
+          <w:ilvl w:val="0"/>
+          <w:numId w:val="66"/>
+        </w:numPr>
+      </w:pPr>
+      <w:r>
+        <w:t xml:space="preserve">14/04/2026 </w:t>
+      </w:r>
+      <w:proofErr w:type="spellStart"/>
+      <w:r>
+        <w:t>Bugfix</w:t>
+      </w:r>
+      <w:proofErr w:type="spellEnd"/>
+      <w:r>
+        <w:t xml:space="preserve"> query Statistiche Costi</w:t>
+      </w:r>
+    </w:p>
+    <w:p>
+      <w:pPr>
+        <w:pStyle w:val="Paragrafoelenco"/>
+        <w:numPr>
+          <w:ilvl w:val="0"/>
+          <w:numId w:val="66"/>
+        </w:numPr>
+      </w:pPr>
+      <w:r>
+        <w:t xml:space="preserve">31/03/2026 Report Collaboratori: </w:t>
+      </w:r>
+      <w:proofErr w:type="spellStart"/>
+      <w:r>
+        <w:t>bugfix</w:t>
+      </w:r>
+      <w:proofErr w:type="spellEnd"/>
+      <w:r>
+        <w:t xml:space="preserve"> nella ricerca quando manca indirizzo e città</w:t>
+      </w:r>
+    </w:p>
+    <w:p>
+      <w:pPr>
+        <w:pStyle w:val="Paragrafoelenco"/>
+        <w:numPr>
+          <w:ilvl w:val="0"/>
+          <w:numId w:val="66"/>
+        </w:numPr>
+      </w:pPr>
+      <w:r>
+        <w:t xml:space="preserve">20/03/2026 Statistica Costi: </w:t>
+      </w:r>
+      <w:proofErr w:type="spellStart"/>
+      <w:r>
+        <w:t>Bugfix</w:t>
+      </w:r>
+      <w:proofErr w:type="spellEnd"/>
+      <w:r>
+        <w:t xml:space="preserve"> nome collaboratori</w:t>
+      </w:r>
+    </w:p>
+    <w:p>
+      <w:pPr>
+        <w:pStyle w:val="Paragrafoelenco"/>
+        <w:numPr>
+          <w:ilvl w:val="0"/>
+          <w:numId w:val="66"/>
+        </w:numPr>
+      </w:pPr>
+      <w:r>
+        <w:t xml:space="preserve">19/03/2026 Scadenzario: </w:t>
+      </w:r>
+      <w:proofErr w:type="spellStart"/>
+      <w:r>
+        <w:t>bugfix</w:t>
+      </w:r>
+      <w:proofErr w:type="spellEnd"/>
+      <w:r>
+        <w:t xml:space="preserve"> filtro fornitori e clienti che includeva anche buste paga</w:t>
+      </w:r>
+    </w:p>
+    <w:p>
+      <w:pPr>
+        <w:pStyle w:val="Paragrafoelenco"/>
+        <w:numPr>
+          <w:ilvl w:val="0"/>
+          <w:numId w:val="66"/>
+        </w:numPr>
+      </w:pPr>
+      <w:r>
+        <w:t>17/03/2026 Statistiche Ricavi: ripristino dell'importo lordo</w:t>
+      </w:r>
+    </w:p>
+    <w:p>
+      <w:pPr>
+        <w:pStyle w:val="Paragrafoelenco"/>
+        <w:numPr>
+          <w:ilvl w:val="0"/>
+          <w:numId w:val="66"/>
+        </w:numPr>
+      </w:pPr>
+      <w:r>
+        <w:t>17/03/2026 Statistiche: sostituzione dell'importo lordo con l'importo netto; Scadenzario: filtro busta paga aggiunto in 'tutti'</w:t>
+      </w:r>
+    </w:p>
+    <w:p>
+      <w:pPr>
+        <w:pStyle w:val="Paragrafoelenco"/>
+        <w:numPr>
+          <w:ilvl w:val="0"/>
+          <w:numId w:val="66"/>
+        </w:numPr>
+      </w:pPr>
+      <w:r>
+        <w:t>15/03/2026 Statistiche costi: filtro fornitore agisce anche sul collaboratore, le diarie vengono elencate e non più raggruppate</w:t>
+      </w:r>
+    </w:p>
+    <w:p>
+      <w:pPr>
+        <w:pStyle w:val="Paragrafoelenco"/>
+        <w:numPr>
+          <w:ilvl w:val="0"/>
+          <w:numId w:val="66"/>
+        </w:numPr>
+      </w:pPr>
+      <w:r>
+        <w:t>08/03/2026 Statistiche costi: separazione collaboratori assunti; data esatta nei collaboratori; Statistiche ricavi: totale listino costo e ricavo in cima alla griglia</w:t>
+      </w:r>
+    </w:p>
+    <w:p>
+      <w:pPr>
+        <w:pStyle w:val="Paragrafoelenco"/>
+        <w:numPr>
+          <w:ilvl w:val="0"/>
+          <w:numId w:val="66"/>
+        </w:numPr>
+      </w:pPr>
+      <w:r>
+        <w:t>26/02/2026 Modifica query statistiche Costi</w:t>
+      </w:r>
+    </w:p>
+    <w:p>
+      <w:pPr>
+        <w:pStyle w:val="Paragrafoelenco"/>
+        <w:numPr>
+          <w:ilvl w:val="0"/>
+          <w:numId w:val="66"/>
+        </w:numPr>
+      </w:pPr>
+      <w:r>
+        <w:t>24/02/2026 Visualizzazione Documento Offerta in Statistiche Costi se non presente fattura; Impaginazione e visualizzazione totali in cima alla griglia in statistiche Costi</w:t>
+      </w:r>
+    </w:p>
+    <w:p>
+      <w:pPr>
+        <w:pStyle w:val="Paragrafoelenco"/>
+        <w:numPr>
+          <w:ilvl w:val="0"/>
+          <w:numId w:val="66"/>
+        </w:numPr>
+      </w:pPr>
+      <w:r>
+        <w:t>14/02/2026 Visualizzazione Collaboratori</w:t>
+      </w:r>
+    </w:p>
+    <w:p>
+      <w:pPr>
+        <w:pStyle w:val="Paragrafoelenco"/>
+        <w:numPr>
+          <w:ilvl w:val="0"/>
+          <w:numId w:val="66"/>
+        </w:numPr>
+      </w:pPr>
+      <w:r>
+        <w:t>14/02/2026 Separazione Collaboratori a Fattura; Impaginazione Statistiche Costi</w:t>
+      </w:r>
+    </w:p>
+    <w:p>
+      <w:pPr>
+        <w:pStyle w:val="Paragrafoelenco"/>
+        <w:numPr>
+          <w:ilvl w:val="0"/>
+          <w:numId w:val="66"/>
+        </w:numPr>
+      </w:pPr>
+      <w:r>
+        <w:t xml:space="preserve">14/02/2026 </w:t>
+      </w:r>
+      <w:proofErr w:type="spellStart"/>
+      <w:r>
+        <w:t>Bugfix</w:t>
+      </w:r>
+      <w:proofErr w:type="spellEnd"/>
+      <w:r>
+        <w:t xml:space="preserve"> statistica costi, visualizzazione fattura e interventi minori</w:t>
+      </w:r>
+    </w:p>
+    <w:p>
+      <w:pPr>
+        <w:pStyle w:val="Paragrafoelenco"/>
+        <w:numPr>
+          <w:ilvl w:val="0"/>
+          <w:numId w:val="66"/>
+        </w:numPr>
+      </w:pPr>
+      <w:r>
+        <w:t xml:space="preserve">08/02/2026 </w:t>
+      </w:r>
+      <w:proofErr w:type="spellStart"/>
+      <w:r>
+        <w:t>Bugfix</w:t>
+      </w:r>
+      <w:proofErr w:type="spellEnd"/>
+      <w:r>
+        <w:t xml:space="preserve"> lavorazione e statistiche costi</w:t>
+      </w:r>
+    </w:p>
+    <w:p>
+      <w:pPr>
+        <w:pStyle w:val="Paragrafoelenco"/>
+        <w:numPr>
+          <w:ilvl w:val="0"/>
+          <w:numId w:val="66"/>
+        </w:numPr>
+      </w:pPr>
+      <w:r>
+        <w:t>31/01/2026 Nuova gestione Genere Gruppo Sottogruppo; Modifiche varie</w:t>
+      </w:r>
+    </w:p>
+    <w:p>
+      <w:pPr>
+        <w:pStyle w:val="Paragrafoelenco"/>
+        <w:numPr>
+          <w:ilvl w:val="0"/>
+          <w:numId w:val="66"/>
+        </w:numPr>
+      </w:pPr>
+      <w:r>
+        <w:t>05/01/2026 Modifica tipologia Personale Tecnico</w:t>
+      </w:r>
+    </w:p>
+    <w:p>
+      <w:pPr>
+        <w:pStyle w:val="Paragrafoelenco"/>
+        <w:numPr>
+          <w:ilvl w:val="0"/>
+          <w:numId w:val="66"/>
+        </w:numPr>
+      </w:pPr>
+      <w:r>
+        <w:t>10/12/2025 Nuovo filtro scadenzario; Modifica note consuntivo</w:t>
+      </w:r>
+    </w:p>
+    <w:p>
+      <w:pPr>
+        <w:pStyle w:val="Paragrafoelenco"/>
+        <w:numPr>
+          <w:ilvl w:val="0"/>
+          <w:numId w:val="66"/>
+        </w:numPr>
+      </w:pPr>
+      <w:r>
+        <w:t xml:space="preserve">30/11/2025 </w:t>
+      </w:r>
+      <w:proofErr w:type="spellStart"/>
+      <w:r>
+        <w:t>Bugfix</w:t>
+      </w:r>
+      <w:proofErr w:type="spellEnd"/>
+      <w:r>
+        <w:t xml:space="preserve"> Collaboratori di Giornata</w:t>
+      </w:r>
+    </w:p>
+    <w:p>
+      <w:pPr>
+        <w:pStyle w:val="Paragrafoelenco"/>
+        <w:numPr>
+          <w:ilvl w:val="0"/>
+          <w:numId w:val="66"/>
+        </w:numPr>
+      </w:pPr>
+      <w:r>
+        <w:t xml:space="preserve">21/11/2025 </w:t>
+      </w:r>
+      <w:proofErr w:type="spellStart"/>
+      <w:r>
+        <w:t>Bugfix</w:t>
+      </w:r>
+      <w:proofErr w:type="spellEnd"/>
+      <w:r>
+        <w:t xml:space="preserve"> protocollo; Campo protocollo in scadenzario; colonna ex-dipendenti disabilitata di default</w:t>
+      </w:r>
+    </w:p>
+    <w:p>
+      <w:pPr>
+        <w:pStyle w:val="Paragrafoelenco"/>
+        <w:numPr>
+          <w:ilvl w:val="0"/>
+          <w:numId w:val="66"/>
+        </w:numPr>
+      </w:pPr>
+      <w:r>
+        <w:t>20/11/2025 Nuovo stato 'Fattura SDI' attivabile in fase di protocollo; nuova colonna 'Ex-dipendenti' in Agenda; correzione bug nella query dello Scadenzario</w:t>
+      </w:r>
+    </w:p>
+    <w:p>
+      <w:pPr>
+        <w:pStyle w:val="Paragrafoelenco"/>
+        <w:numPr>
+          <w:ilvl w:val="0"/>
+          <w:numId w:val="66"/>
+        </w:numPr>
+      </w:pPr>
+      <w:r>
+        <w:t>27/09/2025 Bug filtri date in Stampa Collaboratori</w:t>
+      </w:r>
+    </w:p>
+    <w:p>
+      <w:pPr>
+        <w:pStyle w:val="Paragrafoelenco"/>
+        <w:numPr>
+          <w:ilvl w:val="0"/>
+          <w:numId w:val="66"/>
+        </w:numPr>
+      </w:pPr>
+      <w:r>
+        <w:t xml:space="preserve">23/09/2025 Modifica al campo Quantità in </w:t>
+      </w:r>
+      <w:proofErr w:type="spellStart"/>
+      <w:r>
+        <w:t>Dati_Articoli_Lavorazione</w:t>
+      </w:r>
+      <w:proofErr w:type="spellEnd"/>
+    </w:p>
+    <w:p>
+      <w:pPr>
+        <w:pStyle w:val="Paragrafoelenco"/>
+        <w:numPr>
+          <w:ilvl w:val="0"/>
+          <w:numId w:val="66"/>
+        </w:numPr>
+      </w:pPr>
+      <w:r>
         <w:lastRenderedPageBreak/>
-        <w:t xml:space="preserve">20/05/2026 Rimborso km: impostato importo lordo uguale al netto; Figure professionali: esclusi dalla ricerca i collaboratori non attivi; validazione specifica per CF; Report Consulente Lavoro: quota mista nella query letta dalla tabella di </w:t>
-      </w:r>
-      <w:proofErr w:type="spellStart"/>
-      <w:r>
-        <w:t>config</w:t>
-      </w:r>
-      <w:proofErr w:type="spellEnd"/>
-      <w:r>
-        <w:t>; aggiunto conteggio collaboratori estratti; Scadenzario: aggiunto filtro mese/anno per impostare ricerca più velocemente</w:t>
+        <w:t>19/05/2025 Campo Cliente/Fornitore obbligatorio in Protocolli</w:t>
       </w:r>
     </w:p>
     <w:p>
@@ -413,7 +901,7 @@
         </w:numPr>
       </w:pPr>
       <w:r>
-        <w:t>16/05/2026 Stampa Collaboratori: sezione eliminata (disabilitata) Stampa Consulente del lavoro: Rinominato in Stampa Collaboratori; Visualizzazioni dettagliata e sintetica; Riorganizzazione delle colonne; Pulsante stampa nascosto; Nuovo filtro tempo determinato/indeterminato; Nome lavorazione spostato nel riepilogo; Filtro Nominativo spostato come prima voce Scadenzario: Nuovo filtro lavorazione (aggiunta anche colonna in griglia risultati)</w:t>
+        <w:t>04/04/2025 Segnalazione Statistiche costi</w:t>
       </w:r>
     </w:p>
     <w:p>
@@ -425,23 +913,7 @@
         </w:numPr>
       </w:pPr>
       <w:r>
-        <w:t xml:space="preserve">05/05/2026 Statistiche ricavi: </w:t>
-      </w:r>
-      <w:proofErr w:type="spellStart"/>
-      <w:r>
-        <w:t>bugfix</w:t>
-      </w:r>
-      <w:proofErr w:type="spellEnd"/>
-      <w:r>
-        <w:t xml:space="preserve"> query; Anagrafica collaboratori: </w:t>
-      </w:r>
-      <w:proofErr w:type="spellStart"/>
-      <w:r>
-        <w:t>bugfix</w:t>
-      </w:r>
-      <w:proofErr w:type="spellEnd"/>
-      <w:r>
-        <w:t xml:space="preserve"> inserimento telefono</w:t>
+        <w:t>30/03/2025 Ricerca in scadenzario per data fattura e interventi vari su Protocollo e Scadenzario</w:t>
       </w:r>
     </w:p>
     <w:p>
@@ -453,13 +925,8 @@
         </w:numPr>
       </w:pPr>
       <w:r>
-        <w:t xml:space="preserve">04/05/2026 Anagrafica collaboratori: campi obbligatori; Lavorazione: sostituita voce 'Rimborso km' con 'Mista'; Stampa consulente del lavoro: prime modifiche per nuovi filtri (non terminata); </w:t>
-      </w:r>
-      <w:proofErr w:type="spellStart"/>
-      <w:r>
-        <w:t>bugfix</w:t>
-      </w:r>
-      <w:proofErr w:type="spellEnd"/>
+        <w:t>16/07/2024 Modifiche Gestione Protocolli, Statistiche Ricavi ed errore creazione Offerta</w:t>
+      </w:r>
     </w:p>
     <w:p>
       <w:pPr>
@@ -470,445 +937,6 @@
         </w:numPr>
       </w:pPr>
       <w:r>
-        <w:t xml:space="preserve">24/04/2026 Statistiche Costi: link alla lavorazione, filtro mese ed anno, descrizione lavorazione nell'intestazione, </w:t>
-      </w:r>
-      <w:proofErr w:type="spellStart"/>
-      <w:r>
-        <w:t>bugfix</w:t>
-      </w:r>
-      <w:proofErr w:type="spellEnd"/>
-    </w:p>
-    <w:p>
-      <w:pPr>
-        <w:pStyle w:val="Paragrafoelenco"/>
-        <w:numPr>
-          <w:ilvl w:val="0"/>
-          <w:numId w:val="66"/>
-        </w:numPr>
-      </w:pPr>
-      <w:r>
-        <w:t xml:space="preserve">21/04/2026 Statistiche Costi: </w:t>
-      </w:r>
-      <w:proofErr w:type="spellStart"/>
-      <w:r>
-        <w:t>Bugfix</w:t>
-      </w:r>
-      <w:proofErr w:type="spellEnd"/>
-      <w:r>
-        <w:t xml:space="preserve"> ricerca e popolamento tendina sottogruppo</w:t>
-      </w:r>
-    </w:p>
-    <w:p>
-      <w:pPr>
-        <w:pStyle w:val="Paragrafoelenco"/>
-        <w:numPr>
-          <w:ilvl w:val="0"/>
-          <w:numId w:val="66"/>
-        </w:numPr>
-      </w:pPr>
-      <w:r>
-        <w:t xml:space="preserve">14/04/2026 </w:t>
-      </w:r>
-      <w:proofErr w:type="spellStart"/>
-      <w:r>
-        <w:t>Bugfix</w:t>
-      </w:r>
-      <w:proofErr w:type="spellEnd"/>
-      <w:r>
-        <w:t xml:space="preserve"> Statistiche Costi</w:t>
-      </w:r>
-    </w:p>
-    <w:p>
-      <w:pPr>
-        <w:pStyle w:val="Paragrafoelenco"/>
-        <w:numPr>
-          <w:ilvl w:val="0"/>
-          <w:numId w:val="66"/>
-        </w:numPr>
-      </w:pPr>
-      <w:r>
-        <w:t xml:space="preserve">14/04/2026 </w:t>
-      </w:r>
-      <w:proofErr w:type="spellStart"/>
-      <w:r>
-        <w:t>Bugfix</w:t>
-      </w:r>
-      <w:proofErr w:type="spellEnd"/>
-      <w:r>
-        <w:t xml:space="preserve"> query Statistiche Costi</w:t>
-      </w:r>
-    </w:p>
-    <w:p>
-      <w:pPr>
-        <w:pStyle w:val="Paragrafoelenco"/>
-        <w:numPr>
-          <w:ilvl w:val="0"/>
-          <w:numId w:val="66"/>
-        </w:numPr>
-      </w:pPr>
-      <w:r>
-        <w:t xml:space="preserve">31/03/2026 Report Collaboratori: </w:t>
-      </w:r>
-      <w:proofErr w:type="spellStart"/>
-      <w:r>
-        <w:t>bugfix</w:t>
-      </w:r>
-      <w:proofErr w:type="spellEnd"/>
-      <w:r>
-        <w:t xml:space="preserve"> nella ricerca quando manca indirizzo e città</w:t>
-      </w:r>
-    </w:p>
-    <w:p>
-      <w:pPr>
-        <w:pStyle w:val="Paragrafoelenco"/>
-        <w:numPr>
-          <w:ilvl w:val="0"/>
-          <w:numId w:val="66"/>
-        </w:numPr>
-      </w:pPr>
-      <w:r>
-        <w:t xml:space="preserve">20/03/2026 Statistica Costi: </w:t>
-      </w:r>
-      <w:proofErr w:type="spellStart"/>
-      <w:r>
-        <w:t>Bugfix</w:t>
-      </w:r>
-      <w:proofErr w:type="spellEnd"/>
-      <w:r>
-        <w:t xml:space="preserve"> nome collaboratori</w:t>
-      </w:r>
-    </w:p>
-    <w:p>
-      <w:pPr>
-        <w:pStyle w:val="Paragrafoelenco"/>
-        <w:numPr>
-          <w:ilvl w:val="0"/>
-          <w:numId w:val="66"/>
-        </w:numPr>
-      </w:pPr>
-      <w:r>
-        <w:t xml:space="preserve">19/03/2026 Scadenzario: </w:t>
-      </w:r>
-      <w:proofErr w:type="spellStart"/>
-      <w:r>
-        <w:t>bugfix</w:t>
-      </w:r>
-      <w:proofErr w:type="spellEnd"/>
-      <w:r>
-        <w:t xml:space="preserve"> filtro fornitori e clienti che includeva anche buste paga</w:t>
-      </w:r>
-    </w:p>
-    <w:p>
-      <w:pPr>
-        <w:pStyle w:val="Paragrafoelenco"/>
-        <w:numPr>
-          <w:ilvl w:val="0"/>
-          <w:numId w:val="66"/>
-        </w:numPr>
-      </w:pPr>
-      <w:r>
-        <w:t>17/03/2026 Statistiche Ricavi: ripristino dell'importo lordo</w:t>
-      </w:r>
-    </w:p>
-    <w:p>
-      <w:pPr>
-        <w:pStyle w:val="Paragrafoelenco"/>
-        <w:numPr>
-          <w:ilvl w:val="0"/>
-          <w:numId w:val="66"/>
-        </w:numPr>
-      </w:pPr>
-      <w:r>
-        <w:t>17/03/2026 Statistiche: sostituzione dell'importo lordo con l'importo netto; Scadenzario: filtro busta paga aggiunto in 'tutti'</w:t>
-      </w:r>
-    </w:p>
-    <w:p>
-      <w:pPr>
-        <w:pStyle w:val="Paragrafoelenco"/>
-        <w:numPr>
-          <w:ilvl w:val="0"/>
-          <w:numId w:val="66"/>
-        </w:numPr>
-      </w:pPr>
-      <w:r>
-        <w:t>15/03/2026 Statistiche costi: filtro fornitore agisce anche sul collaboratore, le diarie vengono elencate e non più raggruppate</w:t>
-      </w:r>
-    </w:p>
-    <w:p>
-      <w:pPr>
-        <w:pStyle w:val="Paragrafoelenco"/>
-        <w:numPr>
-          <w:ilvl w:val="0"/>
-          <w:numId w:val="66"/>
-        </w:numPr>
-      </w:pPr>
-      <w:r>
-        <w:t>08/03/2026 Statistiche costi: separazione collaboratori assunti; data esatta nei collaboratori; Statistiche ricavi: totale listino costo e ricavo in cima alla griglia</w:t>
-      </w:r>
-    </w:p>
-    <w:p>
-      <w:pPr>
-        <w:pStyle w:val="Paragrafoelenco"/>
-        <w:numPr>
-          <w:ilvl w:val="0"/>
-          <w:numId w:val="66"/>
-        </w:numPr>
-      </w:pPr>
-      <w:r>
-        <w:t>26/02/2026 Modifica query statistiche Costi</w:t>
-      </w:r>
-    </w:p>
-    <w:p>
-      <w:pPr>
-        <w:pStyle w:val="Paragrafoelenco"/>
-        <w:numPr>
-          <w:ilvl w:val="0"/>
-          <w:numId w:val="66"/>
-        </w:numPr>
-      </w:pPr>
-      <w:r>
-        <w:t>24/02/2026 Visualizzazione Documento Offerta in Statistiche Costi se non presente fattura; Impaginazione e visualizzazione totali in cima alla griglia in statistiche Costi</w:t>
-      </w:r>
-    </w:p>
-    <w:p>
-      <w:pPr>
-        <w:pStyle w:val="Paragrafoelenco"/>
-        <w:numPr>
-          <w:ilvl w:val="0"/>
-          <w:numId w:val="66"/>
-        </w:numPr>
-      </w:pPr>
-      <w:r>
-        <w:t>14/02/2026 Visualizzazione Collaboratori</w:t>
-      </w:r>
-    </w:p>
-    <w:p>
-      <w:pPr>
-        <w:pStyle w:val="Paragrafoelenco"/>
-        <w:numPr>
-          <w:ilvl w:val="0"/>
-          <w:numId w:val="66"/>
-        </w:numPr>
-      </w:pPr>
-      <w:r>
-        <w:t>14/02/2026 Separazione Collaboratori a Fattura; Impaginazione Statistiche Costi</w:t>
-      </w:r>
-    </w:p>
-    <w:p>
-      <w:pPr>
-        <w:pStyle w:val="Paragrafoelenco"/>
-        <w:numPr>
-          <w:ilvl w:val="0"/>
-          <w:numId w:val="66"/>
-        </w:numPr>
-      </w:pPr>
-      <w:r>
-        <w:t xml:space="preserve">14/02/2026 </w:t>
-      </w:r>
-      <w:proofErr w:type="spellStart"/>
-      <w:r>
-        <w:t>Bugfix</w:t>
-      </w:r>
-      <w:proofErr w:type="spellEnd"/>
-      <w:r>
-        <w:t xml:space="preserve"> statistica costi, visualizzazione fattura e interventi minori</w:t>
-      </w:r>
-    </w:p>
-    <w:p>
-      <w:pPr>
-        <w:pStyle w:val="Paragrafoelenco"/>
-        <w:numPr>
-          <w:ilvl w:val="0"/>
-          <w:numId w:val="66"/>
-        </w:numPr>
-      </w:pPr>
-      <w:r>
-        <w:t xml:space="preserve">08/02/2026 </w:t>
-      </w:r>
-      <w:proofErr w:type="spellStart"/>
-      <w:r>
-        <w:t>Bugfix</w:t>
-      </w:r>
-      <w:proofErr w:type="spellEnd"/>
-      <w:r>
-        <w:t xml:space="preserve"> lavorazione e statistiche costi</w:t>
-      </w:r>
-    </w:p>
-    <w:p>
-      <w:pPr>
-        <w:pStyle w:val="Paragrafoelenco"/>
-        <w:numPr>
-          <w:ilvl w:val="0"/>
-          <w:numId w:val="66"/>
-        </w:numPr>
-      </w:pPr>
-      <w:r>
-        <w:t>31/01/2026 Nuova gestione Genere Gruppo Sottogruppo; Modifiche varie</w:t>
-      </w:r>
-    </w:p>
-    <w:p>
-      <w:pPr>
-        <w:pStyle w:val="Paragrafoelenco"/>
-        <w:numPr>
-          <w:ilvl w:val="0"/>
-          <w:numId w:val="66"/>
-        </w:numPr>
-      </w:pPr>
-      <w:r>
-        <w:t>05/01/2026 Modifica tipologia Personale Tecnico</w:t>
-      </w:r>
-    </w:p>
-    <w:p>
-      <w:pPr>
-        <w:pStyle w:val="Paragrafoelenco"/>
-        <w:numPr>
-          <w:ilvl w:val="0"/>
-          <w:numId w:val="66"/>
-        </w:numPr>
-      </w:pPr>
-      <w:r>
-        <w:t>10/12/2025 Nuovo filtro scadenzario; Modifica note consuntivo</w:t>
-      </w:r>
-    </w:p>
-    <w:p>
-      <w:pPr>
-        <w:pStyle w:val="Paragrafoelenco"/>
-        <w:numPr>
-          <w:ilvl w:val="0"/>
-          <w:numId w:val="66"/>
-        </w:numPr>
-      </w:pPr>
-      <w:r>
-        <w:t xml:space="preserve">30/11/2025 </w:t>
-      </w:r>
-      <w:proofErr w:type="spellStart"/>
-      <w:r>
-        <w:t>Bugfix</w:t>
-      </w:r>
-      <w:proofErr w:type="spellEnd"/>
-      <w:r>
-        <w:t xml:space="preserve"> Collaboratori di Giornata</w:t>
-      </w:r>
-    </w:p>
-    <w:p>
-      <w:pPr>
-        <w:pStyle w:val="Paragrafoelenco"/>
-        <w:numPr>
-          <w:ilvl w:val="0"/>
-          <w:numId w:val="66"/>
-        </w:numPr>
-      </w:pPr>
-      <w:r>
-        <w:t xml:space="preserve">21/11/2025 </w:t>
-      </w:r>
-      <w:proofErr w:type="spellStart"/>
-      <w:r>
-        <w:t>Bugfix</w:t>
-      </w:r>
-      <w:proofErr w:type="spellEnd"/>
-      <w:r>
-        <w:t xml:space="preserve"> protocollo; Campo protocollo in scadenzario; colonna ex-dipendenti disabilitata di default</w:t>
-      </w:r>
-    </w:p>
-    <w:p>
-      <w:pPr>
-        <w:pStyle w:val="Paragrafoelenco"/>
-        <w:numPr>
-          <w:ilvl w:val="0"/>
-          <w:numId w:val="66"/>
-        </w:numPr>
-      </w:pPr>
-      <w:r>
-        <w:t>20/11/2025 Nuovo stato 'Fattura SDI' attivabile in fase di protocollo; nuova colonna 'Ex-dipendenti' in Agenda; correzione bug nella query dello Scadenzario</w:t>
-      </w:r>
-    </w:p>
-    <w:p>
-      <w:pPr>
-        <w:pStyle w:val="Paragrafoelenco"/>
-        <w:numPr>
-          <w:ilvl w:val="0"/>
-          <w:numId w:val="66"/>
-        </w:numPr>
-      </w:pPr>
-      <w:r>
-        <w:t>27/09/2025 Bug filtri date in Stampa Collaboratori</w:t>
-      </w:r>
-    </w:p>
-    <w:p>
-      <w:pPr>
-        <w:pStyle w:val="Paragrafoelenco"/>
-        <w:numPr>
-          <w:ilvl w:val="0"/>
-          <w:numId w:val="66"/>
-        </w:numPr>
-      </w:pPr>
-      <w:r>
-        <w:t xml:space="preserve">23/09/2025 Modifica al campo Quantità in </w:t>
-      </w:r>
-      <w:proofErr w:type="spellStart"/>
-      <w:r>
-        <w:t>Dati_Articoli_Lavorazione</w:t>
-      </w:r>
-      <w:proofErr w:type="spellEnd"/>
-    </w:p>
-    <w:p>
-      <w:pPr>
-        <w:pStyle w:val="Paragrafoelenco"/>
-        <w:numPr>
-          <w:ilvl w:val="0"/>
-          <w:numId w:val="66"/>
-        </w:numPr>
-      </w:pPr>
-      <w:r>
-        <w:t>19/05/2025 Campo Cliente/Fornitore obbligatorio in Protocolli</w:t>
-      </w:r>
-    </w:p>
-    <w:p>
-      <w:pPr>
-        <w:pStyle w:val="Paragrafoelenco"/>
-        <w:numPr>
-          <w:ilvl w:val="0"/>
-          <w:numId w:val="66"/>
-        </w:numPr>
-      </w:pPr>
-      <w:r>
-        <w:t>04/04/2025 Segnalazione Statistiche costi</w:t>
-      </w:r>
-    </w:p>
-    <w:p>
-      <w:pPr>
-        <w:pStyle w:val="Paragrafoelenco"/>
-        <w:numPr>
-          <w:ilvl w:val="0"/>
-          <w:numId w:val="66"/>
-        </w:numPr>
-      </w:pPr>
-      <w:r>
-        <w:t>30/03/2025 Ricerca in scadenzario per data fattura e interventi vari su Protocollo e Scadenzario</w:t>
-      </w:r>
-    </w:p>
-    <w:p>
-      <w:pPr>
-        <w:pStyle w:val="Paragrafoelenco"/>
-        <w:numPr>
-          <w:ilvl w:val="0"/>
-          <w:numId w:val="66"/>
-        </w:numPr>
-      </w:pPr>
-      <w:r>
-        <w:t>16/07/2024 Modifiche Gestione Protocolli, Statistiche Ricavi ed errore creazione Offerta</w:t>
-      </w:r>
-    </w:p>
-    <w:p>
-      <w:pPr>
-        <w:pStyle w:val="Paragrafoelenco"/>
-        <w:numPr>
-          <w:ilvl w:val="0"/>
-          <w:numId w:val="66"/>
-        </w:numPr>
-      </w:pPr>
-      <w:r>
-        <w:lastRenderedPageBreak/>
         <w:t>12/07/2024 Modifiche Protocollazione</w:t>
       </w:r>
     </w:p>
@@ -1356,6 +1384,7 @@
         </w:numPr>
       </w:pPr>
       <w:r>
+        <w:lastRenderedPageBreak/>
         <w:t>Aggiunto indirizzo operativo a Documenti trasporto</w:t>
       </w:r>
     </w:p>
@@ -1376,7 +1405,6 @@
         <w:pStyle w:val="Sottotitolo"/>
       </w:pPr>
       <w:r>
-        <w:lastRenderedPageBreak/>
         <w:t>Versione 1.93 del 08/10/2021</w:t>
       </w:r>
     </w:p>
@@ -1807,6 +1835,7 @@
         </w:numPr>
       </w:pPr>
       <w:r>
+        <w:lastRenderedPageBreak/>
         <w:t>Scadenzario: ripristino data inizio lavorazione come data fattura</w:t>
       </w:r>
     </w:p>
@@ -1827,20 +1856,468 @@
         </w:numPr>
       </w:pPr>
       <w:r>
+        <w:t>Eliminazione Fattura – l’ultimo numero fattura viene ripristinato</w:t>
+      </w:r>
+    </w:p>
+    <w:p>
+      <w:pPr>
+        <w:pStyle w:val="Paragrafoelenco"/>
+        <w:numPr>
+          <w:ilvl w:val="0"/>
+          <w:numId w:val="57"/>
+        </w:numPr>
+      </w:pPr>
+      <w:r>
+        <w:t>Protocollo, ricerca nominativo Collaboratori (previa selezione da combo box “Clienti/Collaboratori”)</w:t>
+      </w:r>
+    </w:p>
+    <w:p>
+      <w:pPr>
+        <w:pStyle w:val="Sottotitolo"/>
+      </w:pPr>
+      <w:r>
+        <w:t>Versione 1.83 del 20/05/2020</w:t>
+      </w:r>
+    </w:p>
+    <w:p>
+      <w:pPr>
+        <w:pStyle w:val="Paragrafoelenco"/>
+        <w:numPr>
+          <w:ilvl w:val="0"/>
+          <w:numId w:val="56"/>
+        </w:numPr>
+      </w:pPr>
+      <w:r>
+        <w:t>Aggiunta Cancellazione Fattura e Rate Scadenzario associate dal dettaglio Lavorazione.</w:t>
+      </w:r>
+    </w:p>
+    <w:p>
+      <w:pPr>
+        <w:pStyle w:val="Paragrafoelenco"/>
+        <w:numPr>
+          <w:ilvl w:val="0"/>
+          <w:numId w:val="56"/>
+        </w:numPr>
+      </w:pPr>
+      <w:r>
+        <w:t>Statistiche Costi, raggruppamento in categorie</w:t>
+      </w:r>
+    </w:p>
+    <w:p>
+      <w:pPr>
+        <w:pStyle w:val="Sottotitolo"/>
+      </w:pPr>
+      <w:r>
+        <w:t>Versione 1.82 del 15/05/2020</w:t>
+      </w:r>
+    </w:p>
+    <w:p>
+      <w:pPr>
+        <w:pStyle w:val="Paragrafoelenco"/>
+        <w:numPr>
+          <w:ilvl w:val="0"/>
+          <w:numId w:val="55"/>
+        </w:numPr>
+      </w:pPr>
+      <w:r>
+        <w:t>Modifica data in inserimento scadenzario</w:t>
+      </w:r>
+    </w:p>
+    <w:p>
+      <w:pPr>
+        <w:pStyle w:val="Paragrafoelenco"/>
+        <w:numPr>
+          <w:ilvl w:val="0"/>
+          <w:numId w:val="55"/>
+        </w:numPr>
+      </w:pPr>
+      <w:r>
+        <w:t>Aggiunto report Popup Collaboratori per giorno su pagina Agenda e su dettaglio Lavorazione</w:t>
+      </w:r>
+    </w:p>
+    <w:p>
+      <w:pPr>
+        <w:pStyle w:val="Sottotitolo"/>
+      </w:pPr>
+      <w:r>
+        <w:t>Versione 1.81 del 1</w:t>
+      </w:r>
+      <w:r>
+        <w:t>1</w:t>
+      </w:r>
+      <w:r>
+        <w:t>/05/2020</w:t>
+      </w:r>
+    </w:p>
+    <w:p>
+      <w:pPr>
+        <w:pStyle w:val="Paragrafoelenco"/>
+        <w:numPr>
+          <w:ilvl w:val="0"/>
+          <w:numId w:val="54"/>
+        </w:numPr>
+      </w:pPr>
+      <w:r>
+        <w:t>Sistemazione Scadenzario</w:t>
+      </w:r>
+    </w:p>
+    <w:p>
+      <w:pPr>
+        <w:pStyle w:val="Paragrafoelenco"/>
+        <w:numPr>
+          <w:ilvl w:val="0"/>
+          <w:numId w:val="54"/>
+        </w:numPr>
+      </w:pPr>
+      <w:r>
+        <w:t>Completato Report Collaboratori per giornata</w:t>
+      </w:r>
+    </w:p>
+    <w:p>
+      <w:pPr>
+        <w:pStyle w:val="Sottotitolo"/>
+      </w:pPr>
+      <w:r>
+        <w:t>Versione 1.80 del 08/05/2020</w:t>
+      </w:r>
+    </w:p>
+    <w:p>
+      <w:pPr>
+        <w:pStyle w:val="Paragrafoelenco"/>
+        <w:numPr>
+          <w:ilvl w:val="0"/>
+          <w:numId w:val="53"/>
+        </w:numPr>
+      </w:pPr>
+      <w:r>
+        <w:t>Scadenzario: funzione modifica scadenze pagate e risultati ricerca che rimangono invariati dopo le operazioni</w:t>
+      </w:r>
+    </w:p>
+    <w:p>
+      <w:pPr>
+        <w:pStyle w:val="Paragrafoelenco"/>
+        <w:numPr>
+          <w:ilvl w:val="0"/>
+          <w:numId w:val="53"/>
+        </w:numPr>
+      </w:pPr>
+      <w:r>
+        <w:t>Agenda: data selezionata che rimane anche dopo apertura altre pagine menù</w:t>
+      </w:r>
+    </w:p>
+    <w:p>
+      <w:pPr>
+        <w:pStyle w:val="Paragrafoelenco"/>
+        <w:numPr>
+          <w:ilvl w:val="0"/>
+          <w:numId w:val="53"/>
+        </w:numPr>
+      </w:pPr>
+      <w:r>
+        <w:t>Statistiche costi: filtro fatturato impostato di default</w:t>
+      </w:r>
+    </w:p>
+    <w:p>
+      <w:pPr>
+        <w:pStyle w:val="Sottotitolo"/>
+      </w:pPr>
+      <w:r>
+        <w:t>Versione 1.79 del 05/05/2020</w:t>
+      </w:r>
+    </w:p>
+    <w:p>
+      <w:pPr>
+        <w:pStyle w:val="Paragrafoelenco"/>
+        <w:numPr>
+          <w:ilvl w:val="0"/>
+          <w:numId w:val="52"/>
+        </w:numPr>
+      </w:pPr>
+      <w:r>
+        <w:t xml:space="preserve">Ordinamento decrescente scadenze; </w:t>
+      </w:r>
+    </w:p>
+    <w:p>
+      <w:pPr>
+        <w:pStyle w:val="Paragrafoelenco"/>
+        <w:numPr>
+          <w:ilvl w:val="0"/>
+          <w:numId w:val="52"/>
+        </w:numPr>
+      </w:pPr>
+      <w:r>
+        <w:t xml:space="preserve">Data fine = data inizio negli intervalli; </w:t>
+      </w:r>
+    </w:p>
+    <w:p>
+      <w:pPr>
+        <w:pStyle w:val="Paragrafoelenco"/>
+        <w:numPr>
+          <w:ilvl w:val="0"/>
+          <w:numId w:val="52"/>
+        </w:numPr>
+      </w:pPr>
+      <w:r>
+        <w:t xml:space="preserve">data agenda in sessione; </w:t>
+      </w:r>
+    </w:p>
+    <w:p>
+      <w:pPr>
+        <w:pStyle w:val="Paragrafoelenco"/>
+        <w:numPr>
+          <w:ilvl w:val="0"/>
+          <w:numId w:val="52"/>
+        </w:numPr>
+      </w:pPr>
+      <w:r>
+        <w:t>Ricerca “like” numero fattura;</w:t>
+      </w:r>
+    </w:p>
+    <w:p>
+      <w:pPr>
+        <w:pStyle w:val="Paragrafoelenco"/>
+        <w:numPr>
+          <w:ilvl w:val="0"/>
+          <w:numId w:val="52"/>
+        </w:numPr>
+      </w:pPr>
+      <w:r>
+        <w:t>modificata pagina ricerca protocolli (invertiti campi);</w:t>
+      </w:r>
+    </w:p>
+    <w:p>
+      <w:pPr>
+        <w:pStyle w:val="Paragrafoelenco"/>
+        <w:numPr>
+          <w:ilvl w:val="0"/>
+          <w:numId w:val="52"/>
+        </w:numPr>
+      </w:pPr>
+      <w:r>
+        <w:t>Aggiunta pagina report collaboratori per giornata da menu report (NON completa);</w:t>
+      </w:r>
+    </w:p>
+    <w:p>
+      <w:pPr>
+        <w:pStyle w:val="Sottotitolo"/>
+      </w:pPr>
+      <w:r>
+        <w:t xml:space="preserve">Versione 1.78 del </w:t>
+      </w:r>
+      <w:r>
+        <w:t>02</w:t>
+      </w:r>
+      <w:r>
+        <w:t>/0</w:t>
+      </w:r>
+      <w:r>
+        <w:t>5</w:t>
+      </w:r>
+      <w:r>
+        <w:t>/2020</w:t>
+      </w:r>
+    </w:p>
+    <w:p>
+      <w:pPr>
+        <w:pStyle w:val="Paragrafoelenco"/>
+        <w:numPr>
+          <w:ilvl w:val="0"/>
+          <w:numId w:val="52"/>
+        </w:numPr>
+      </w:pPr>
+      <w:r>
+        <w:t>Aggiunta statistica costi</w:t>
+      </w:r>
+    </w:p>
+    <w:p>
+      <w:pPr>
+        <w:pStyle w:val="Paragrafoelenco"/>
+        <w:numPr>
+          <w:ilvl w:val="0"/>
+          <w:numId w:val="52"/>
+        </w:numPr>
+      </w:pPr>
+      <w:r>
+        <w:t xml:space="preserve">Scadenzario: inserimento </w:t>
+      </w:r>
+      <w:proofErr w:type="spellStart"/>
+      <w:r>
+        <w:t>idPadre</w:t>
+      </w:r>
+      <w:proofErr w:type="spellEnd"/>
+      <w:r>
+        <w:t xml:space="preserve"> per gestire modifica scadenze splittate; inserimento </w:t>
+      </w:r>
+      <w:proofErr w:type="spellStart"/>
+      <w:r>
+        <w:t>importoVersatoIva</w:t>
+      </w:r>
+      <w:proofErr w:type="spellEnd"/>
+      <w:r>
+        <w:t xml:space="preserve"> e </w:t>
+      </w:r>
+      <w:proofErr w:type="spellStart"/>
+      <w:r>
+        <w:t>importoRiscossoIva</w:t>
+      </w:r>
+      <w:proofErr w:type="spellEnd"/>
+      <w:r>
+        <w:t xml:space="preserve"> nel </w:t>
+      </w:r>
+      <w:proofErr w:type="spellStart"/>
+      <w:r>
+        <w:t>db</w:t>
+      </w:r>
+      <w:proofErr w:type="spellEnd"/>
+      <w:r>
+        <w:t xml:space="preserve"> per risolvere bug di importi con decimali errati</w:t>
+      </w:r>
+    </w:p>
+    <w:p>
+      <w:pPr>
+        <w:pStyle w:val="Paragrafoelenco"/>
+        <w:numPr>
+          <w:ilvl w:val="0"/>
+          <w:numId w:val="52"/>
+        </w:numPr>
+      </w:pPr>
+      <w:r>
+        <w:t>Aggiunta stampa Riepilogo personale impegnato per giornata. (menù laterale destro)</w:t>
+      </w:r>
+    </w:p>
+    <w:p>
+      <w:pPr>
+        <w:pStyle w:val="Sottotitolo"/>
+      </w:pPr>
+      <w:r>
+        <w:t>Versione 1.77 del 28/04/2020</w:t>
+      </w:r>
+    </w:p>
+    <w:p>
+      <w:pPr>
+        <w:pStyle w:val="Paragrafoelenco"/>
+        <w:numPr>
+          <w:ilvl w:val="0"/>
+          <w:numId w:val="51"/>
+        </w:numPr>
+      </w:pPr>
+      <w:r>
+        <w:t xml:space="preserve">Scadenzario: inserimento tipologia pagamento (banca); </w:t>
+      </w:r>
+    </w:p>
+    <w:p>
+      <w:pPr>
+        <w:pStyle w:val="Paragrafoelenco"/>
+        <w:numPr>
+          <w:ilvl w:val="0"/>
+          <w:numId w:val="51"/>
+        </w:numPr>
+      </w:pPr>
+      <w:r>
+        <w:t>ottimizzazione campi vari</w:t>
+      </w:r>
+    </w:p>
+    <w:p>
+      <w:pPr>
+        <w:pStyle w:val="Paragrafoelenco"/>
+        <w:numPr>
+          <w:ilvl w:val="0"/>
+          <w:numId w:val="51"/>
+        </w:numPr>
+      </w:pPr>
+      <w:r>
+        <w:t>risolto bug range di date lavorazione su protocollo</w:t>
+      </w:r>
+    </w:p>
+    <w:p>
+      <w:pPr>
+        <w:pStyle w:val="Sottotitolo"/>
+      </w:pPr>
+      <w:r>
+        <w:t>Versione 1.76 del 25/04/2020</w:t>
+      </w:r>
+    </w:p>
+    <w:p>
+      <w:pPr>
+        <w:pStyle w:val="Paragrafoelenco"/>
+        <w:numPr>
+          <w:ilvl w:val="0"/>
+          <w:numId w:val="50"/>
+        </w:numPr>
+      </w:pPr>
+      <w:r>
+        <w:t xml:space="preserve">Aggiunta funzionalità 'saldo totale' nello scadenzario; </w:t>
+      </w:r>
+    </w:p>
+    <w:p>
+      <w:pPr>
+        <w:pStyle w:val="Paragrafoelenco"/>
+        <w:numPr>
+          <w:ilvl w:val="0"/>
+          <w:numId w:val="50"/>
+        </w:numPr>
+      </w:pPr>
+      <w:r>
+        <w:t xml:space="preserve">Adeguamento scadenzario alla nuova tabella </w:t>
+      </w:r>
+      <w:proofErr w:type="spellStart"/>
+      <w:r>
+        <w:t>tipi_banche</w:t>
+      </w:r>
+      <w:proofErr w:type="spellEnd"/>
+    </w:p>
+    <w:p>
+      <w:pPr>
+        <w:pStyle w:val="Sottotitolo"/>
+      </w:pPr>
+      <w:r>
         <w:lastRenderedPageBreak/>
-        <w:t>Eliminazione Fattura – l’ultimo numero fattura viene ripristinato</w:t>
-      </w:r>
-    </w:p>
-    <w:p>
-      <w:pPr>
-        <w:pStyle w:val="Paragrafoelenco"/>
-        <w:numPr>
-          <w:ilvl w:val="0"/>
-          <w:numId w:val="57"/>
-        </w:numPr>
-      </w:pPr>
-      <w:r>
-        <w:t>Protocollo, ricerca nominativo Collaboratori (previa selezione da combo box “Clienti/Collaboratori”)</w:t>
+        <w:t>Versione 1.</w:t>
+      </w:r>
+      <w:r>
+        <w:t>75</w:t>
+      </w:r>
+      <w:r>
+        <w:t xml:space="preserve"> del </w:t>
+      </w:r>
+      <w:r>
+        <w:t>23</w:t>
+      </w:r>
+      <w:r>
+        <w:t>/</w:t>
+      </w:r>
+      <w:r>
+        <w:t>04</w:t>
+      </w:r>
+      <w:r>
+        <w:t>/20</w:t>
+      </w:r>
+      <w:r>
+        <w:t>20</w:t>
+      </w:r>
+    </w:p>
+    <w:p>
+      <w:pPr>
+        <w:pStyle w:val="Paragrafoelenco"/>
+        <w:numPr>
+          <w:ilvl w:val="0"/>
+          <w:numId w:val="50"/>
+        </w:numPr>
+      </w:pPr>
+      <w:r>
+        <w:t>Aggiunto campo ritenuta di acconto in report collaboratori</w:t>
+      </w:r>
+    </w:p>
+    <w:p>
+      <w:pPr>
+        <w:pStyle w:val="Paragrafoelenco"/>
+        <w:numPr>
+          <w:ilvl w:val="0"/>
+          <w:numId w:val="50"/>
+        </w:numPr>
+      </w:pPr>
+      <w:r>
+        <w:t>File allegato in statistiche ricavi</w:t>
       </w:r>
     </w:p>
     <w:p>
@@ -1848,31 +2325,79 @@
         <w:pStyle w:val="Sottotitolo"/>
       </w:pPr>
       <w:r>
-        <w:t>Versione 1.83 del 20/05/2020</w:t>
-      </w:r>
-    </w:p>
-    <w:p>
-      <w:pPr>
-        <w:pStyle w:val="Paragrafoelenco"/>
-        <w:numPr>
-          <w:ilvl w:val="0"/>
-          <w:numId w:val="56"/>
-        </w:numPr>
-      </w:pPr>
-      <w:r>
-        <w:t>Aggiunta Cancellazione Fattura e Rate Scadenzario associate dal dettaglio Lavorazione.</w:t>
-      </w:r>
-    </w:p>
-    <w:p>
-      <w:pPr>
-        <w:pStyle w:val="Paragrafoelenco"/>
-        <w:numPr>
-          <w:ilvl w:val="0"/>
-          <w:numId w:val="56"/>
-        </w:numPr>
-      </w:pPr>
-      <w:r>
-        <w:t>Statistiche Costi, raggruppamento in categorie</w:t>
+        <w:t>Versione 1.</w:t>
+      </w:r>
+      <w:r>
+        <w:t>74</w:t>
+      </w:r>
+      <w:r>
+        <w:t xml:space="preserve"> del </w:t>
+      </w:r>
+      <w:r>
+        <w:t>20</w:t>
+      </w:r>
+      <w:r>
+        <w:t>/</w:t>
+      </w:r>
+      <w:r>
+        <w:t>04</w:t>
+      </w:r>
+      <w:r>
+        <w:t>/20</w:t>
+      </w:r>
+      <w:r>
+        <w:t>20</w:t>
+      </w:r>
+    </w:p>
+    <w:p>
+      <w:pPr>
+        <w:pStyle w:val="Paragrafoelenco"/>
+        <w:numPr>
+          <w:ilvl w:val="0"/>
+          <w:numId w:val="49"/>
+        </w:numPr>
+      </w:pPr>
+      <w:r>
+        <w:t>Ripristinata ricerca protocollo con campi testo</w:t>
+      </w:r>
+    </w:p>
+    <w:p>
+      <w:pPr>
+        <w:pStyle w:val="Paragrafoelenco"/>
+        <w:numPr>
+          <w:ilvl w:val="0"/>
+          <w:numId w:val="49"/>
+        </w:numPr>
+      </w:pPr>
+      <w:r>
+        <w:t xml:space="preserve">Aggiunta in tabelle la gestione </w:t>
+      </w:r>
+      <w:r>
+        <w:t>Tipologie Banca Scadenzario</w:t>
+      </w:r>
+    </w:p>
+    <w:p>
+      <w:pPr>
+        <w:pStyle w:val="Paragrafoelenco"/>
+        <w:numPr>
+          <w:ilvl w:val="0"/>
+          <w:numId w:val="49"/>
+        </w:numPr>
+      </w:pPr>
+      <w:r>
+        <w:t>Aggiunta possibilità di selezionare nello Scadenzario i valori presenti nella Tipologia Banca</w:t>
+      </w:r>
+    </w:p>
+    <w:p>
+      <w:pPr>
+        <w:pStyle w:val="Paragrafoelenco"/>
+        <w:numPr>
+          <w:ilvl w:val="0"/>
+          <w:numId w:val="49"/>
+        </w:numPr>
+      </w:pPr>
+      <w:r>
+        <w:t>Aggiustamenti importi Scadenzario</w:t>
       </w:r>
     </w:p>
     <w:p>
@@ -1880,31 +2405,73 @@
         <w:pStyle w:val="Sottotitolo"/>
       </w:pPr>
       <w:r>
-        <w:t>Versione 1.82 del 15/05/2020</w:t>
-      </w:r>
-    </w:p>
-    <w:p>
-      <w:pPr>
-        <w:pStyle w:val="Paragrafoelenco"/>
-        <w:numPr>
-          <w:ilvl w:val="0"/>
-          <w:numId w:val="55"/>
-        </w:numPr>
-      </w:pPr>
-      <w:r>
-        <w:t>Modifica data in inserimento scadenzario</w:t>
-      </w:r>
-    </w:p>
-    <w:p>
-      <w:pPr>
-        <w:pStyle w:val="Paragrafoelenco"/>
-        <w:numPr>
-          <w:ilvl w:val="0"/>
-          <w:numId w:val="55"/>
-        </w:numPr>
-      </w:pPr>
-      <w:r>
-        <w:t>Aggiunto report Popup Collaboratori per giorno su pagina Agenda e su dettaglio Lavorazione</w:t>
+        <w:t>Versione 1.</w:t>
+      </w:r>
+      <w:r>
+        <w:t>73</w:t>
+      </w:r>
+      <w:r>
+        <w:t xml:space="preserve"> del </w:t>
+      </w:r>
+      <w:r>
+        <w:t>19</w:t>
+      </w:r>
+      <w:r>
+        <w:t>/</w:t>
+      </w:r>
+      <w:r>
+        <w:t>04</w:t>
+      </w:r>
+      <w:r>
+        <w:t>/20</w:t>
+      </w:r>
+      <w:r>
+        <w:t>20</w:t>
+      </w:r>
+    </w:p>
+    <w:p>
+      <w:pPr>
+        <w:pStyle w:val="Paragrafoelenco"/>
+        <w:numPr>
+          <w:ilvl w:val="0"/>
+          <w:numId w:val="48"/>
+        </w:numPr>
+      </w:pPr>
+      <w:r>
+        <w:t>Statistiche: aggiunto elenco contratti, visualizzazione degli importi lordi invece di quelli netti, soluzione bug nei filtri</w:t>
+      </w:r>
+      <w:r>
+        <w:t>.</w:t>
+      </w:r>
+    </w:p>
+    <w:p>
+      <w:pPr>
+        <w:pStyle w:val="Paragrafoelenco"/>
+        <w:numPr>
+          <w:ilvl w:val="0"/>
+          <w:numId w:val="48"/>
+        </w:numPr>
+      </w:pPr>
+      <w:r>
+        <w:t>Scadenzario: visualizzazione importi lordi al posto di quelli netti nella griglia; in inserimento e modifica viene adesso impostato importo lordo e da quello calcolato il netto</w:t>
+      </w:r>
+      <w:r>
+        <w:t>.</w:t>
+      </w:r>
+    </w:p>
+    <w:p>
+      <w:pPr>
+        <w:pStyle w:val="Paragrafoelenco"/>
+        <w:numPr>
+          <w:ilvl w:val="0"/>
+          <w:numId w:val="48"/>
+        </w:numPr>
+      </w:pPr>
+      <w:r>
+        <w:t>Protocollo: modificato ordine filtri; produzione, lavorazione e cliente visualizzati come elenchi con campo ricerca</w:t>
+      </w:r>
+      <w:r>
+        <w:t>.</w:t>
       </w:r>
     </w:p>
     <w:p>
@@ -1912,37 +2479,46 @@
         <w:pStyle w:val="Sottotitolo"/>
       </w:pPr>
       <w:r>
-        <w:t>Versione 1.81 del 1</w:t>
-      </w:r>
-      <w:r>
-        <w:t>1</w:t>
-      </w:r>
-      <w:r>
-        <w:t>/05/2020</w:t>
-      </w:r>
-    </w:p>
-    <w:p>
-      <w:pPr>
-        <w:pStyle w:val="Paragrafoelenco"/>
-        <w:numPr>
-          <w:ilvl w:val="0"/>
-          <w:numId w:val="54"/>
-        </w:numPr>
-      </w:pPr>
-      <w:r>
-        <w:t>Sistemazione Scadenzario</w:t>
-      </w:r>
-    </w:p>
-    <w:p>
-      <w:pPr>
-        <w:pStyle w:val="Paragrafoelenco"/>
-        <w:numPr>
-          <w:ilvl w:val="0"/>
-          <w:numId w:val="54"/>
-        </w:numPr>
-      </w:pPr>
-      <w:r>
-        <w:t>Completato Report Collaboratori per giornata</w:t>
+        <w:t>Versione 1.</w:t>
+      </w:r>
+      <w:r>
+        <w:t>72</w:t>
+      </w:r>
+      <w:r>
+        <w:t xml:space="preserve"> del </w:t>
+      </w:r>
+      <w:r>
+        <w:t>16</w:t>
+      </w:r>
+      <w:r>
+        <w:t>/</w:t>
+      </w:r>
+      <w:r>
+        <w:t>04</w:t>
+      </w:r>
+      <w:r>
+        <w:t>/20</w:t>
+      </w:r>
+      <w:r>
+        <w:t>20</w:t>
+      </w:r>
+    </w:p>
+    <w:p>
+      <w:pPr>
+        <w:pStyle w:val="Paragrafoelenco"/>
+        <w:numPr>
+          <w:ilvl w:val="0"/>
+          <w:numId w:val="48"/>
+        </w:numPr>
+      </w:pPr>
+      <w:r>
+        <w:t xml:space="preserve">Aggiunta </w:t>
+      </w:r>
+      <w:r>
+        <w:t xml:space="preserve">voce </w:t>
+      </w:r>
+      <w:r>
+        <w:t>Statistica ricavi sotto al menù STATISTICHE.</w:t>
       </w:r>
     </w:p>
     <w:p>
@@ -1950,43 +2526,68 @@
         <w:pStyle w:val="Sottotitolo"/>
       </w:pPr>
       <w:r>
-        <w:t>Versione 1.80 del 08/05/2020</w:t>
-      </w:r>
-    </w:p>
-    <w:p>
-      <w:pPr>
-        <w:pStyle w:val="Paragrafoelenco"/>
-        <w:numPr>
-          <w:ilvl w:val="0"/>
-          <w:numId w:val="53"/>
-        </w:numPr>
-      </w:pPr>
-      <w:r>
-        <w:t>Scadenzario: funzione modifica scadenze pagate e risultati ricerca che rimangono invariati dopo le operazioni</w:t>
-      </w:r>
-    </w:p>
-    <w:p>
-      <w:pPr>
-        <w:pStyle w:val="Paragrafoelenco"/>
-        <w:numPr>
-          <w:ilvl w:val="0"/>
-          <w:numId w:val="53"/>
-        </w:numPr>
-      </w:pPr>
-      <w:r>
-        <w:t>Agenda: data selezionata che rimane anche dopo apertura altre pagine menù</w:t>
-      </w:r>
-    </w:p>
-    <w:p>
-      <w:pPr>
-        <w:pStyle w:val="Paragrafoelenco"/>
-        <w:numPr>
-          <w:ilvl w:val="0"/>
-          <w:numId w:val="53"/>
-        </w:numPr>
-      </w:pPr>
-      <w:r>
-        <w:t>Statistiche costi: filtro fatturato impostato di default</w:t>
+        <w:t>Versione 1.</w:t>
+      </w:r>
+      <w:r>
+        <w:t>71</w:t>
+      </w:r>
+      <w:r>
+        <w:t xml:space="preserve"> del </w:t>
+      </w:r>
+      <w:r>
+        <w:t>13</w:t>
+      </w:r>
+      <w:r>
+        <w:t>/</w:t>
+      </w:r>
+      <w:r>
+        <w:t>04</w:t>
+      </w:r>
+      <w:r>
+        <w:t>/20</w:t>
+      </w:r>
+      <w:r>
+        <w:t>20</w:t>
+      </w:r>
+    </w:p>
+    <w:p>
+      <w:pPr>
+        <w:pStyle w:val="Paragrafoelenco"/>
+        <w:numPr>
+          <w:ilvl w:val="0"/>
+          <w:numId w:val="48"/>
+        </w:numPr>
+      </w:pPr>
+      <w:r>
+        <w:t xml:space="preserve">Modifiche Menù, voce report </w:t>
+      </w:r>
+      <w:proofErr w:type="spellStart"/>
+      <w:r>
+        <w:t>tltime</w:t>
+      </w:r>
+      <w:proofErr w:type="spellEnd"/>
+      <w:r>
+        <w:t xml:space="preserve"> spostata sotto Report, aggiunti </w:t>
+      </w:r>
+      <w:proofErr w:type="gramStart"/>
+      <w:r>
+        <w:t>3</w:t>
+      </w:r>
+      <w:proofErr w:type="gramEnd"/>
+      <w:r>
+        <w:t xml:space="preserve"> bottoni di accesso ra</w:t>
+      </w:r>
+      <w:r>
+        <w:t xml:space="preserve">pido nel menù di destra in basso, sotto FILTRO </w:t>
+      </w:r>
+      <w:r>
+        <w:t xml:space="preserve">COLONNE </w:t>
+      </w:r>
+      <w:r>
+        <w:t>AGENDA</w:t>
+      </w:r>
+      <w:r>
+        <w:t>.</w:t>
       </w:r>
     </w:p>
     <w:p>
@@ -1994,79 +2595,40 @@
         <w:pStyle w:val="Sottotitolo"/>
       </w:pPr>
       <w:r>
-        <w:t>Versione 1.79 del 05/05/2020</w:t>
-      </w:r>
-    </w:p>
-    <w:p>
-      <w:pPr>
-        <w:pStyle w:val="Paragrafoelenco"/>
-        <w:numPr>
-          <w:ilvl w:val="0"/>
-          <w:numId w:val="52"/>
-        </w:numPr>
-      </w:pPr>
-      <w:r>
-        <w:t xml:space="preserve">Ordinamento decrescente scadenze; </w:t>
-      </w:r>
-    </w:p>
-    <w:p>
-      <w:pPr>
-        <w:pStyle w:val="Paragrafoelenco"/>
-        <w:numPr>
-          <w:ilvl w:val="0"/>
-          <w:numId w:val="52"/>
-        </w:numPr>
-      </w:pPr>
-      <w:r>
-        <w:t xml:space="preserve">Data fine = data inizio negli intervalli; </w:t>
-      </w:r>
-    </w:p>
-    <w:p>
-      <w:pPr>
-        <w:pStyle w:val="Paragrafoelenco"/>
-        <w:numPr>
-          <w:ilvl w:val="0"/>
-          <w:numId w:val="52"/>
-        </w:numPr>
-      </w:pPr>
-      <w:r>
-        <w:t xml:space="preserve">data agenda in sessione; </w:t>
-      </w:r>
-    </w:p>
-    <w:p>
-      <w:pPr>
-        <w:pStyle w:val="Paragrafoelenco"/>
-        <w:numPr>
-          <w:ilvl w:val="0"/>
-          <w:numId w:val="52"/>
-        </w:numPr>
-      </w:pPr>
-      <w:r>
-        <w:t>Ricerca “like” numero fattura;</w:t>
-      </w:r>
-    </w:p>
-    <w:p>
-      <w:pPr>
-        <w:pStyle w:val="Paragrafoelenco"/>
-        <w:numPr>
-          <w:ilvl w:val="0"/>
-          <w:numId w:val="52"/>
-        </w:numPr>
-      </w:pPr>
-      <w:r>
-        <w:t>modificata pagina ricerca protocolli (invertiti campi);</w:t>
-      </w:r>
-    </w:p>
-    <w:p>
-      <w:pPr>
-        <w:pStyle w:val="Paragrafoelenco"/>
-        <w:numPr>
-          <w:ilvl w:val="0"/>
-          <w:numId w:val="52"/>
-        </w:numPr>
-      </w:pPr>
-      <w:r>
-        <w:t>Aggiunta pagina report collaboratori per giornata da menu report (NON completa);</w:t>
+        <w:t>Versione 1.</w:t>
+      </w:r>
+      <w:r>
+        <w:t>70</w:t>
+      </w:r>
+      <w:r>
+        <w:t xml:space="preserve"> del </w:t>
+      </w:r>
+      <w:r>
+        <w:t>15</w:t>
+      </w:r>
+      <w:r>
+        <w:t>/</w:t>
+      </w:r>
+      <w:r>
+        <w:t>03</w:t>
+      </w:r>
+      <w:r>
+        <w:t>/20</w:t>
+      </w:r>
+      <w:r>
+        <w:t>20</w:t>
+      </w:r>
+    </w:p>
+    <w:p>
+      <w:pPr>
+        <w:pStyle w:val="Paragrafoelenco"/>
+        <w:numPr>
+          <w:ilvl w:val="0"/>
+          <w:numId w:val="47"/>
+        </w:numPr>
+      </w:pPr>
+      <w:r>
+        <w:t>Aggiornamento scadenzario</w:t>
       </w:r>
     </w:p>
     <w:p>
@@ -2074,167 +2636,728 @@
         <w:pStyle w:val="Sottotitolo"/>
       </w:pPr>
       <w:r>
-        <w:t xml:space="preserve">Versione 1.78 del </w:t>
+        <w:t>Versione 1.</w:t>
+      </w:r>
+      <w:r>
+        <w:t>69</w:t>
+      </w:r>
+      <w:r>
+        <w:t xml:space="preserve"> del </w:t>
       </w:r>
       <w:r>
         <w:t>02</w:t>
       </w:r>
       <w:r>
-        <w:t>/0</w:t>
-      </w:r>
-      <w:r>
-        <w:t>5</w:t>
-      </w:r>
-      <w:r>
-        <w:t>/2020</w:t>
-      </w:r>
-    </w:p>
-    <w:p>
-      <w:pPr>
-        <w:pStyle w:val="Paragrafoelenco"/>
-        <w:numPr>
-          <w:ilvl w:val="0"/>
-          <w:numId w:val="52"/>
-        </w:numPr>
-      </w:pPr>
-      <w:r>
-        <w:t>Aggiunta statistica costi</w:t>
-      </w:r>
-    </w:p>
-    <w:p>
-      <w:pPr>
-        <w:pStyle w:val="Paragrafoelenco"/>
-        <w:numPr>
-          <w:ilvl w:val="0"/>
-          <w:numId w:val="52"/>
-        </w:numPr>
-      </w:pPr>
-      <w:r>
-        <w:t xml:space="preserve">Scadenzario: inserimento </w:t>
+        <w:t>/</w:t>
+      </w:r>
+      <w:r>
+        <w:t>03</w:t>
+      </w:r>
+      <w:r>
+        <w:t>/20</w:t>
+      </w:r>
+      <w:r>
+        <w:t>20</w:t>
+      </w:r>
+    </w:p>
+    <w:p>
+      <w:pPr>
+        <w:pStyle w:val="Paragrafoelenco"/>
+        <w:numPr>
+          <w:ilvl w:val="0"/>
+          <w:numId w:val="46"/>
+        </w:numPr>
+      </w:pPr>
+      <w:r>
+        <w:t>Aggiunta modifica data Fattura su stampa Fattura</w:t>
+      </w:r>
+    </w:p>
+    <w:p>
+      <w:pPr>
+        <w:pStyle w:val="Sottotitolo"/>
+      </w:pPr>
+      <w:r>
+        <w:t>Versione 1.</w:t>
+      </w:r>
+      <w:r>
+        <w:t>68</w:t>
+      </w:r>
+      <w:r>
+        <w:t xml:space="preserve"> del </w:t>
+      </w:r>
+      <w:r>
+        <w:t>29</w:t>
+      </w:r>
+      <w:r>
+        <w:t>/</w:t>
+      </w:r>
+      <w:r>
+        <w:t>02</w:t>
+      </w:r>
+      <w:r>
+        <w:t>/20</w:t>
+      </w:r>
+      <w:r>
+        <w:t>20</w:t>
+      </w:r>
+    </w:p>
+    <w:p>
+      <w:pPr>
+        <w:pStyle w:val="Paragrafoelenco"/>
+        <w:numPr>
+          <w:ilvl w:val="0"/>
+          <w:numId w:val="45"/>
+        </w:numPr>
+      </w:pPr>
+      <w:r>
+        <w:t>Completata funzionalità gestione Magazzino per Lavorazione con stampa PDF</w:t>
+      </w:r>
+      <w:r>
+        <w:t xml:space="preserve"> (Tasto MAGAZZINO su pagina Lavorazione)</w:t>
+      </w:r>
+      <w:r>
+        <w:t>.</w:t>
+      </w:r>
+    </w:p>
+    <w:p>
+      <w:pPr>
+        <w:pStyle w:val="Sottotitolo"/>
+      </w:pPr>
+      <w:r>
+        <w:t>Versione 1.</w:t>
+      </w:r>
+      <w:r>
+        <w:t>67</w:t>
+      </w:r>
+      <w:r>
+        <w:t xml:space="preserve"> del </w:t>
+      </w:r>
+      <w:r>
+        <w:t>05</w:t>
+      </w:r>
+      <w:r>
+        <w:t>/</w:t>
+      </w:r>
+      <w:r>
+        <w:t>02</w:t>
+      </w:r>
+      <w:r>
+        <w:t>/20</w:t>
+      </w:r>
+      <w:r>
+        <w:t>20</w:t>
+      </w:r>
+    </w:p>
+    <w:p>
+      <w:pPr>
+        <w:pStyle w:val="Paragrafoelenco"/>
+        <w:numPr>
+          <w:ilvl w:val="0"/>
+          <w:numId w:val="44"/>
+        </w:numPr>
+      </w:pPr>
+      <w:r>
+        <w:t xml:space="preserve">Sistemazione nota spese; Aggiunta pulsante annulla per chiudere evento senza salvare; gestione import in piano esterno quando una </w:t>
       </w:r>
       <w:proofErr w:type="spellStart"/>
       <w:r>
-        <w:t>idPadre</w:t>
+        <w:t>fig</w:t>
       </w:r>
       <w:proofErr w:type="spellEnd"/>
       <w:r>
-        <w:t xml:space="preserve"> per gestire modifica scadenze splittate; inserimento </w:t>
+        <w:t xml:space="preserve"> prof viene modificata in </w:t>
       </w:r>
       <w:proofErr w:type="spellStart"/>
       <w:r>
-        <w:t>importoVersatoIva</w:t>
+        <w:t>dett</w:t>
       </w:r>
       <w:proofErr w:type="spellEnd"/>
       <w:r>
-        <w:t xml:space="preserve"> e </w:t>
+        <w:t xml:space="preserve"> economico</w:t>
+      </w:r>
+    </w:p>
+    <w:p>
+      <w:pPr>
+        <w:pStyle w:val="Sottotitolo"/>
+      </w:pPr>
+      <w:r>
+        <w:t>Versione 1.</w:t>
+      </w:r>
+      <w:r>
+        <w:t>66</w:t>
+      </w:r>
+      <w:r>
+        <w:t xml:space="preserve"> del </w:t>
+      </w:r>
+      <w:r>
+        <w:t>01</w:t>
+      </w:r>
+      <w:r>
+        <w:t>/</w:t>
+      </w:r>
+      <w:r>
+        <w:t>02</w:t>
+      </w:r>
+      <w:r>
+        <w:t>/20</w:t>
+      </w:r>
+      <w:r>
+        <w:t>20</w:t>
+      </w:r>
+    </w:p>
+    <w:p>
+      <w:pPr>
+        <w:pStyle w:val="Paragrafoelenco"/>
+        <w:numPr>
+          <w:ilvl w:val="0"/>
+          <w:numId w:val="43"/>
+        </w:numPr>
+      </w:pPr>
+      <w:r>
+        <w:t>Magazzino, campo gruppo dipendente da sub categoria</w:t>
+      </w:r>
+    </w:p>
+    <w:p>
+      <w:pPr>
+        <w:pStyle w:val="Paragrafoelenco"/>
+        <w:numPr>
+          <w:ilvl w:val="0"/>
+          <w:numId w:val="43"/>
+        </w:numPr>
+      </w:pPr>
+      <w:r>
+        <w:t>Nome Pdf fattura con Numero Fattura e non Codice Evento</w:t>
+      </w:r>
+    </w:p>
+    <w:p>
+      <w:pPr>
+        <w:pStyle w:val="Paragrafoelenco"/>
+        <w:numPr>
+          <w:ilvl w:val="0"/>
+          <w:numId w:val="43"/>
+        </w:numPr>
+      </w:pPr>
+      <w:r>
+        <w:t>Report collaboratori, totale in alto.</w:t>
+      </w:r>
+    </w:p>
+    <w:p>
+      <w:pPr>
+        <w:pStyle w:val="Sottotitolo"/>
+      </w:pPr>
+      <w:r>
+        <w:t>Versione 1.</w:t>
+      </w:r>
+      <w:r>
+        <w:t>65</w:t>
+      </w:r>
+      <w:r>
+        <w:t xml:space="preserve"> del </w:t>
+      </w:r>
+      <w:r>
+        <w:t>27</w:t>
+      </w:r>
+      <w:r>
+        <w:t>/</w:t>
+      </w:r>
+      <w:r>
+        <w:t>01</w:t>
+      </w:r>
+      <w:r>
+        <w:t>/20</w:t>
+      </w:r>
+      <w:r>
+        <w:t>20</w:t>
+      </w:r>
+    </w:p>
+    <w:p>
+      <w:pPr>
+        <w:pStyle w:val="Paragrafoelenco"/>
+        <w:numPr>
+          <w:ilvl w:val="0"/>
+          <w:numId w:val="42"/>
+        </w:numPr>
+      </w:pPr>
+      <w:r>
+        <w:t>Ricerca con filtro, Riepilogo e Stampa Collaboratori</w:t>
+      </w:r>
+    </w:p>
+    <w:p>
+      <w:pPr>
+        <w:pStyle w:val="Paragrafoelenco"/>
+        <w:numPr>
+          <w:ilvl w:val="0"/>
+          <w:numId w:val="42"/>
+        </w:numPr>
+      </w:pPr>
+      <w:r>
+        <w:lastRenderedPageBreak/>
+        <w:t>Ricerca con filtro, Riepilogo e Stampa per Consulente del Lavoro</w:t>
+      </w:r>
+    </w:p>
+    <w:p>
+      <w:pPr>
+        <w:pStyle w:val="Sottotitolo"/>
+      </w:pPr>
+      <w:r>
+        <w:t>Versione 1.</w:t>
+      </w:r>
+      <w:r>
+        <w:t>64</w:t>
+      </w:r>
+      <w:r>
+        <w:t xml:space="preserve"> del </w:t>
+      </w:r>
+      <w:r>
+        <w:t>17</w:t>
+      </w:r>
+      <w:r>
+        <w:t>/</w:t>
+      </w:r>
+      <w:r>
+        <w:t>01</w:t>
+      </w:r>
+      <w:r>
+        <w:t>/20</w:t>
+      </w:r>
+      <w:r>
+        <w:t>20</w:t>
+      </w:r>
+    </w:p>
+    <w:p>
+      <w:pPr>
+        <w:pStyle w:val="Paragrafoelenco"/>
+        <w:numPr>
+          <w:ilvl w:val="0"/>
+          <w:numId w:val="41"/>
+        </w:numPr>
+      </w:pPr>
+      <w:r>
+        <w:t>Modifiche visualizzazione griglia magazzino</w:t>
+      </w:r>
+    </w:p>
+    <w:p>
+      <w:pPr>
+        <w:pStyle w:val="Paragrafoelenco"/>
+        <w:numPr>
+          <w:ilvl w:val="0"/>
+          <w:numId w:val="41"/>
+        </w:numPr>
+      </w:pPr>
+      <w:r>
+        <w:t>Modifiche pagina Scadenzario con totali</w:t>
+      </w:r>
+    </w:p>
+    <w:p>
+      <w:pPr>
+        <w:pStyle w:val="Sottotitolo"/>
+      </w:pPr>
+      <w:r>
+        <w:t>Versione 1.</w:t>
+      </w:r>
+      <w:r>
+        <w:t>63</w:t>
+      </w:r>
+      <w:r>
+        <w:t xml:space="preserve"> del </w:t>
+      </w:r>
+      <w:r>
+        <w:t>15</w:t>
+      </w:r>
+      <w:r>
+        <w:t>/</w:t>
+      </w:r>
+      <w:r>
+        <w:t>01</w:t>
+      </w:r>
+      <w:r>
+        <w:t>/20</w:t>
+      </w:r>
+      <w:r>
+        <w:t>20</w:t>
+      </w:r>
+    </w:p>
+    <w:p>
+      <w:pPr>
+        <w:pStyle w:val="Paragrafoelenco"/>
+        <w:numPr>
+          <w:ilvl w:val="0"/>
+          <w:numId w:val="40"/>
+        </w:numPr>
+      </w:pPr>
+      <w:r>
+        <w:t>Campo lavorazione modificabile in fase di offerta</w:t>
+      </w:r>
+    </w:p>
+    <w:p>
+      <w:pPr>
+        <w:pStyle w:val="Paragrafoelenco"/>
+        <w:numPr>
+          <w:ilvl w:val="0"/>
+          <w:numId w:val="40"/>
+        </w:numPr>
+      </w:pPr>
+      <w:r>
+        <w:t>Campo ID non visibile su elenco protocolli</w:t>
+      </w:r>
+    </w:p>
+    <w:p>
+      <w:pPr>
+        <w:pStyle w:val="Sottotitolo"/>
+      </w:pPr>
+      <w:r>
+        <w:t>Versione 1.</w:t>
+      </w:r>
+      <w:r>
+        <w:t>62</w:t>
+      </w:r>
+      <w:r>
+        <w:t xml:space="preserve"> del </w:t>
+      </w:r>
+      <w:r>
+        <w:t>11</w:t>
+      </w:r>
+      <w:r>
+        <w:t>/</w:t>
+      </w:r>
+      <w:r>
+        <w:t>01</w:t>
+      </w:r>
+      <w:r>
+        <w:t>/20</w:t>
+      </w:r>
+      <w:r>
+        <w:t>20</w:t>
+      </w:r>
+    </w:p>
+    <w:p>
+      <w:pPr>
+        <w:pStyle w:val="Paragrafoelenco"/>
+        <w:numPr>
+          <w:ilvl w:val="0"/>
+          <w:numId w:val="39"/>
+        </w:numPr>
+      </w:pPr>
+      <w:r>
+        <w:t>Aggiustamenti pagina Magazzino</w:t>
+      </w:r>
+    </w:p>
+    <w:p>
+      <w:pPr>
+        <w:pStyle w:val="Sottotitolo"/>
+      </w:pPr>
+      <w:r>
+        <w:t>Versione 1.</w:t>
+      </w:r>
+      <w:r>
+        <w:t>61</w:t>
+      </w:r>
+      <w:r>
+        <w:t xml:space="preserve"> del </w:t>
+      </w:r>
+      <w:r>
+        <w:t>29</w:t>
+      </w:r>
+      <w:r>
+        <w:t>/</w:t>
+      </w:r>
+      <w:r>
+        <w:t>12</w:t>
+      </w:r>
+      <w:r>
+        <w:t>/2019</w:t>
+      </w:r>
+    </w:p>
+    <w:p>
+      <w:pPr>
+        <w:pStyle w:val="Paragrafoelenco"/>
+        <w:numPr>
+          <w:ilvl w:val="0"/>
+          <w:numId w:val="38"/>
+        </w:numPr>
+      </w:pPr>
+      <w:r>
+        <w:t>Magazzino: cambiato ordine campi elenco</w:t>
+      </w:r>
+    </w:p>
+    <w:p>
+      <w:pPr>
+        <w:pStyle w:val="Paragrafoelenco"/>
+        <w:numPr>
+          <w:ilvl w:val="0"/>
+          <w:numId w:val="38"/>
+        </w:numPr>
+      </w:pPr>
+      <w:r>
+        <w:t>Campi da liste a tendina ricercati per “uguale” e non per “contiene”</w:t>
+      </w:r>
+    </w:p>
+    <w:p>
+      <w:pPr>
+        <w:pStyle w:val="Paragrafoelenco"/>
+        <w:numPr>
+          <w:ilvl w:val="0"/>
+          <w:numId w:val="38"/>
+        </w:numPr>
+      </w:pPr>
+      <w:r>
+        <w:t xml:space="preserve">Stampa Fattura: distanziato il valore </w:t>
       </w:r>
       <w:proofErr w:type="spellStart"/>
       <w:r>
-        <w:t>importoRiscossoIva</w:t>
+        <w:t>Lav.Rif</w:t>
       </w:r>
       <w:proofErr w:type="spellEnd"/>
       <w:r>
-        <w:t xml:space="preserve"> nel </w:t>
+        <w:t>. dal numero fattura</w:t>
+      </w:r>
+    </w:p>
+    <w:p>
+      <w:pPr>
+        <w:pStyle w:val="Paragrafoelenco"/>
+        <w:numPr>
+          <w:ilvl w:val="0"/>
+          <w:numId w:val="38"/>
+        </w:numPr>
+      </w:pPr>
+      <w:r>
+        <w:t>Aggiunto pulsante “Magazzino” nella pagina della lavorazione per futura gestione attrezzature per lavorazione</w:t>
+      </w:r>
+    </w:p>
+    <w:p>
+      <w:pPr>
+        <w:pStyle w:val="Sottotitolo"/>
+      </w:pPr>
+      <w:r>
+        <w:t>Versione 1.</w:t>
+      </w:r>
+      <w:r>
+        <w:t>60</w:t>
+      </w:r>
+      <w:r>
+        <w:t xml:space="preserve"> del </w:t>
+      </w:r>
+      <w:r>
+        <w:t>21</w:t>
+      </w:r>
+      <w:r>
+        <w:t>/</w:t>
+      </w:r>
+      <w:r>
+        <w:t>12</w:t>
+      </w:r>
+      <w:r>
+        <w:t>/2019</w:t>
+      </w:r>
+    </w:p>
+    <w:p>
+      <w:pPr>
+        <w:pStyle w:val="Paragrafoelenco"/>
+        <w:numPr>
+          <w:ilvl w:val="0"/>
+          <w:numId w:val="37"/>
+        </w:numPr>
+      </w:pPr>
+      <w:r>
+        <w:t>Creazione Fattura in uscita, numero fattura generato in automatico in formato AAAA-NNNN, con progressivo a partire da 1 ogni cambio di anno</w:t>
+      </w:r>
+    </w:p>
+    <w:p>
+      <w:pPr>
+        <w:pStyle w:val="Paragrafoelenco"/>
+        <w:numPr>
+          <w:ilvl w:val="0"/>
+          <w:numId w:val="37"/>
+        </w:numPr>
+      </w:pPr>
+      <w:r>
+        <w:t xml:space="preserve">Modifica pdf fattura in uscita con numero fattura corretto e </w:t>
       </w:r>
       <w:proofErr w:type="spellStart"/>
       <w:r>
-        <w:t>db</w:t>
+        <w:t>N.Rif</w:t>
       </w:r>
       <w:proofErr w:type="spellEnd"/>
       <w:r>
-        <w:t xml:space="preserve"> per risolvere bug di importi con decimali errati</w:t>
-      </w:r>
-    </w:p>
-    <w:p>
-      <w:pPr>
-        <w:pStyle w:val="Paragrafoelenco"/>
-        <w:numPr>
-          <w:ilvl w:val="0"/>
-          <w:numId w:val="52"/>
-        </w:numPr>
-      </w:pPr>
-      <w:r>
-        <w:t>Aggiunta stampa Riepilogo personale impegnato per giornata. (menù laterale destro)</w:t>
+        <w:t>. lavorazione evidenziato accanto (N.B. il protocollo del documento di tipo fattura viene generato allo stesso modo di sempre, il numero fattura viene memorizzato ne campo Riferimento Protocollo).</w:t>
+      </w:r>
+    </w:p>
+    <w:p>
+      <w:pPr>
+        <w:pStyle w:val="Paragrafoelenco"/>
+        <w:numPr>
+          <w:ilvl w:val="0"/>
+          <w:numId w:val="37"/>
+        </w:numPr>
+      </w:pPr>
+      <w:r>
+        <w:t xml:space="preserve">Spostato a destra della griglia dei risultati il tasto di visualizzazione dettaglio protocollo </w:t>
       </w:r>
     </w:p>
     <w:p>
       <w:pPr>
         <w:pStyle w:val="Sottotitolo"/>
       </w:pPr>
-      <w:r>
-        <w:t>Versione 1.77 del 28/04/2020</w:t>
-      </w:r>
-    </w:p>
-    <w:p>
-      <w:pPr>
-        <w:pStyle w:val="Paragrafoelenco"/>
-        <w:numPr>
-          <w:ilvl w:val="0"/>
-          <w:numId w:val="51"/>
-        </w:numPr>
-      </w:pPr>
-      <w:r>
-        <w:t xml:space="preserve">Scadenzario: inserimento tipologia pagamento (banca); </w:t>
-      </w:r>
-    </w:p>
-    <w:p>
-      <w:pPr>
-        <w:pStyle w:val="Paragrafoelenco"/>
-        <w:numPr>
-          <w:ilvl w:val="0"/>
-          <w:numId w:val="51"/>
-        </w:numPr>
-      </w:pPr>
-      <w:r>
-        <w:t>ottimizzazione campi vari</w:t>
-      </w:r>
-    </w:p>
-    <w:p>
-      <w:pPr>
-        <w:pStyle w:val="Paragrafoelenco"/>
-        <w:numPr>
-          <w:ilvl w:val="0"/>
-          <w:numId w:val="51"/>
-        </w:numPr>
-      </w:pPr>
-      <w:r>
-        <w:t>risolto bug range di date lavorazione su protocollo</w:t>
-      </w:r>
     </w:p>
     <w:p>
       <w:pPr>
         <w:pStyle w:val="Sottotitolo"/>
       </w:pPr>
       <w:r>
-        <w:t>Versione 1.76 del 25/04/2020</w:t>
-      </w:r>
-    </w:p>
-    <w:p>
-      <w:pPr>
-        <w:pStyle w:val="Paragrafoelenco"/>
-        <w:numPr>
-          <w:ilvl w:val="0"/>
-          <w:numId w:val="50"/>
-        </w:numPr>
-      </w:pPr>
-      <w:r>
-        <w:t xml:space="preserve">Aggiunta funzionalità 'saldo totale' nello scadenzario; </w:t>
-      </w:r>
-    </w:p>
-    <w:p>
-      <w:pPr>
-        <w:pStyle w:val="Paragrafoelenco"/>
-        <w:numPr>
-          <w:ilvl w:val="0"/>
-          <w:numId w:val="50"/>
-        </w:numPr>
-      </w:pPr>
-      <w:r>
-        <w:t xml:space="preserve">Adeguamento scadenzario alla nuova tabella </w:t>
+        <w:t>Versione 1.</w:t>
+      </w:r>
+      <w:r>
+        <w:t>59</w:t>
+      </w:r>
+      <w:r>
+        <w:t xml:space="preserve"> del </w:t>
+      </w:r>
+      <w:r>
+        <w:t>16</w:t>
+      </w:r>
+      <w:r>
+        <w:t>/</w:t>
+      </w:r>
+      <w:r>
+        <w:t>12</w:t>
+      </w:r>
+      <w:r>
+        <w:t>/2019</w:t>
+      </w:r>
+    </w:p>
+    <w:p>
+      <w:pPr>
+        <w:pStyle w:val="Paragrafoelenco"/>
+        <w:numPr>
+          <w:ilvl w:val="0"/>
+          <w:numId w:val="37"/>
+        </w:numPr>
+      </w:pPr>
+      <w:r>
+        <w:t>Aggiornamento scadenzario</w:t>
+      </w:r>
+    </w:p>
+    <w:p>
+      <w:pPr>
+        <w:pStyle w:val="Sottotitolo"/>
+      </w:pPr>
+      <w:r>
+        <w:t>Versione 1.</w:t>
+      </w:r>
+      <w:r>
+        <w:t>58</w:t>
+      </w:r>
+      <w:r>
+        <w:t xml:space="preserve"> del </w:t>
+      </w:r>
+      <w:r>
+        <w:t>10</w:t>
+      </w:r>
+      <w:r>
+        <w:t>/</w:t>
+      </w:r>
+      <w:r>
+        <w:t>12</w:t>
+      </w:r>
+      <w:r>
+        <w:t>/2019</w:t>
+      </w:r>
+    </w:p>
+    <w:p>
+      <w:pPr>
+        <w:pStyle w:val="Paragrafoelenco"/>
+        <w:numPr>
+          <w:ilvl w:val="0"/>
+          <w:numId w:val="37"/>
+        </w:numPr>
+      </w:pPr>
+      <w:r>
+        <w:t>Aggiunta scadenzario</w:t>
+      </w:r>
+    </w:p>
+    <w:p>
+      <w:pPr>
+        <w:pStyle w:val="Sottotitolo"/>
+      </w:pPr>
+      <w:r>
+        <w:t>Versione 1.</w:t>
+      </w:r>
+      <w:r>
+        <w:t>57</w:t>
+      </w:r>
+      <w:r>
+        <w:t xml:space="preserve"> del </w:t>
+      </w:r>
+      <w:r>
+        <w:t>07</w:t>
+      </w:r>
+      <w:r>
+        <w:t>/</w:t>
+      </w:r>
+      <w:r>
+        <w:t>12</w:t>
+      </w:r>
+      <w:r>
+        <w:t>/2019</w:t>
+      </w:r>
+    </w:p>
+    <w:p>
+      <w:pPr>
+        <w:pStyle w:val="Paragrafoelenco"/>
+        <w:numPr>
+          <w:ilvl w:val="0"/>
+          <w:numId w:val="37"/>
+        </w:numPr>
+      </w:pPr>
+      <w:r>
+        <w:t>Ricerca protocolli per range di date</w:t>
+      </w:r>
+    </w:p>
+    <w:p>
+      <w:pPr>
+        <w:pStyle w:val="Sottotitolo"/>
+      </w:pPr>
+    </w:p>
+    <w:p>
+      <w:pPr>
+        <w:pStyle w:val="Sottotitolo"/>
+      </w:pPr>
+      <w:r>
+        <w:t>Versione 1.</w:t>
+      </w:r>
+      <w:r>
+        <w:t>56</w:t>
+      </w:r>
+      <w:r>
+        <w:t xml:space="preserve"> del </w:t>
+      </w:r>
+      <w:r>
+        <w:t>29</w:t>
+      </w:r>
+      <w:r>
+        <w:t>/</w:t>
+      </w:r>
+      <w:r>
+        <w:t>11</w:t>
+      </w:r>
+      <w:r>
+        <w:t>/2019</w:t>
+      </w:r>
+    </w:p>
+    <w:p>
+      <w:pPr>
+        <w:pStyle w:val="Paragrafoelenco"/>
+        <w:numPr>
+          <w:ilvl w:val="0"/>
+          <w:numId w:val="37"/>
+        </w:numPr>
+      </w:pPr>
+      <w:r>
+        <w:t xml:space="preserve">Aggiunta voce creazione file </w:t>
       </w:r>
       <w:proofErr w:type="spellStart"/>
       <w:r>
-        <w:t>tipi_banche</w:t>
+        <w:t>TLTime</w:t>
       </w:r>
       <w:proofErr w:type="spellEnd"/>
     </w:p>
@@ -2246,1117 +3369,65 @@
         <w:t>Versione 1.</w:t>
       </w:r>
       <w:r>
-        <w:t>75</w:t>
+        <w:t>55</w:t>
       </w:r>
       <w:r>
         <w:t xml:space="preserve"> del </w:t>
       </w:r>
       <w:r>
-        <w:t>23</w:t>
+        <w:t>27</w:t>
       </w:r>
       <w:r>
         <w:t>/</w:t>
       </w:r>
       <w:r>
-        <w:t>04</w:t>
-      </w:r>
-      <w:r>
-        <w:t>/20</w:t>
-      </w:r>
-      <w:r>
-        <w:t>20</w:t>
-      </w:r>
-    </w:p>
-    <w:p>
-      <w:pPr>
-        <w:pStyle w:val="Paragrafoelenco"/>
-        <w:numPr>
-          <w:ilvl w:val="0"/>
-          <w:numId w:val="50"/>
-        </w:numPr>
-      </w:pPr>
-      <w:r>
-        <w:t>Aggiunto campo ritenuta di acconto in report collaboratori</w:t>
-      </w:r>
-    </w:p>
-    <w:p>
-      <w:pPr>
-        <w:pStyle w:val="Paragrafoelenco"/>
-        <w:numPr>
-          <w:ilvl w:val="0"/>
-          <w:numId w:val="50"/>
+        <w:t>11</w:t>
+      </w:r>
+      <w:r>
+        <w:t>/2019</w:t>
+      </w:r>
+    </w:p>
+    <w:p>
+      <w:pPr>
+        <w:pStyle w:val="Paragrafoelenco"/>
+        <w:numPr>
+          <w:ilvl w:val="0"/>
+          <w:numId w:val="36"/>
+        </w:numPr>
+      </w:pPr>
+      <w:r>
+        <w:t>Stampa Piano Esterno: numeri di telefono senza prefisso internazionale</w:t>
+      </w:r>
+    </w:p>
+    <w:p>
+      <w:pPr>
+        <w:pStyle w:val="Paragrafoelenco"/>
+        <w:numPr>
+          <w:ilvl w:val="0"/>
+          <w:numId w:val="36"/>
+        </w:numPr>
+      </w:pPr>
+      <w:r>
+        <w:t>Stampa Piano Esterno: divisione tra date differenti (aggiunta riga vuota di separazione)</w:t>
+      </w:r>
+    </w:p>
+    <w:p>
+      <w:pPr>
+        <w:pStyle w:val="Paragrafoelenco"/>
+        <w:numPr>
+          <w:ilvl w:val="0"/>
+          <w:numId w:val="36"/>
         </w:numPr>
       </w:pPr>
       <w:r>
         <w:lastRenderedPageBreak/>
-        <w:t>File allegato in statistiche ricavi</w:t>
-      </w:r>
-    </w:p>
-    <w:p>
-      <w:pPr>
-        <w:pStyle w:val="Sottotitolo"/>
-      </w:pPr>
-      <w:r>
-        <w:t>Versione 1.</w:t>
-      </w:r>
-      <w:r>
-        <w:t>74</w:t>
-      </w:r>
-      <w:r>
-        <w:t xml:space="preserve"> del </w:t>
-      </w:r>
-      <w:r>
-        <w:t>20</w:t>
-      </w:r>
-      <w:r>
-        <w:t>/</w:t>
-      </w:r>
-      <w:r>
-        <w:t>04</w:t>
-      </w:r>
-      <w:r>
-        <w:t>/20</w:t>
-      </w:r>
-      <w:r>
-        <w:t>20</w:t>
-      </w:r>
-    </w:p>
-    <w:p>
-      <w:pPr>
-        <w:pStyle w:val="Paragrafoelenco"/>
-        <w:numPr>
-          <w:ilvl w:val="0"/>
-          <w:numId w:val="49"/>
-        </w:numPr>
-      </w:pPr>
-      <w:r>
-        <w:t>Ripristinata ricerca protocollo con campi testo</w:t>
-      </w:r>
-    </w:p>
-    <w:p>
-      <w:pPr>
-        <w:pStyle w:val="Paragrafoelenco"/>
-        <w:numPr>
-          <w:ilvl w:val="0"/>
-          <w:numId w:val="49"/>
-        </w:numPr>
-      </w:pPr>
-      <w:r>
-        <w:t xml:space="preserve">Aggiunta in tabelle la gestione </w:t>
-      </w:r>
-      <w:r>
-        <w:t>Tipologie Banca Scadenzario</w:t>
-      </w:r>
-    </w:p>
-    <w:p>
-      <w:pPr>
-        <w:pStyle w:val="Paragrafoelenco"/>
-        <w:numPr>
-          <w:ilvl w:val="0"/>
-          <w:numId w:val="49"/>
-        </w:numPr>
-      </w:pPr>
-      <w:r>
-        <w:t>Aggiunta possibilità di selezionare nello Scadenzario i valori presenti nella Tipologia Banca</w:t>
-      </w:r>
-    </w:p>
-    <w:p>
-      <w:pPr>
-        <w:pStyle w:val="Paragrafoelenco"/>
-        <w:numPr>
-          <w:ilvl w:val="0"/>
-          <w:numId w:val="49"/>
-        </w:numPr>
-      </w:pPr>
-      <w:r>
-        <w:t>Aggiustamenti importi Scadenzario</w:t>
-      </w:r>
-    </w:p>
-    <w:p>
-      <w:pPr>
-        <w:pStyle w:val="Sottotitolo"/>
-      </w:pPr>
-      <w:r>
-        <w:t>Versione 1.</w:t>
-      </w:r>
-      <w:r>
-        <w:t>73</w:t>
-      </w:r>
-      <w:r>
-        <w:t xml:space="preserve"> del </w:t>
-      </w:r>
-      <w:r>
-        <w:t>19</w:t>
-      </w:r>
-      <w:r>
-        <w:t>/</w:t>
-      </w:r>
-      <w:r>
-        <w:t>04</w:t>
-      </w:r>
-      <w:r>
-        <w:t>/20</w:t>
-      </w:r>
-      <w:r>
-        <w:t>20</w:t>
-      </w:r>
-    </w:p>
-    <w:p>
-      <w:pPr>
-        <w:pStyle w:val="Paragrafoelenco"/>
-        <w:numPr>
-          <w:ilvl w:val="0"/>
-          <w:numId w:val="48"/>
-        </w:numPr>
-      </w:pPr>
-      <w:r>
-        <w:t>Statistiche: aggiunto elenco contratti, visualizzazione degli importi lordi invece di quelli netti, soluzione bug nei filtri</w:t>
-      </w:r>
-      <w:r>
-        <w:t>.</w:t>
-      </w:r>
-    </w:p>
-    <w:p>
-      <w:pPr>
-        <w:pStyle w:val="Paragrafoelenco"/>
-        <w:numPr>
-          <w:ilvl w:val="0"/>
-          <w:numId w:val="48"/>
-        </w:numPr>
-      </w:pPr>
-      <w:r>
-        <w:t>Scadenzario: visualizzazione importi lordi al posto di quelli netti nella griglia; in inserimento e modifica viene adesso impostato importo lordo e da quello calcolato il netto</w:t>
-      </w:r>
-      <w:r>
-        <w:t>.</w:t>
-      </w:r>
-    </w:p>
-    <w:p>
-      <w:pPr>
-        <w:pStyle w:val="Paragrafoelenco"/>
-        <w:numPr>
-          <w:ilvl w:val="0"/>
-          <w:numId w:val="48"/>
-        </w:numPr>
-      </w:pPr>
-      <w:r>
-        <w:t>Protocollo: modificato ordine filtri; produzione, lavorazione e cliente visualizzati come elenchi con campo ricerca</w:t>
-      </w:r>
-      <w:r>
-        <w:t>.</w:t>
-      </w:r>
-    </w:p>
-    <w:p>
-      <w:pPr>
-        <w:pStyle w:val="Sottotitolo"/>
-      </w:pPr>
-      <w:r>
-        <w:t>Versione 1.</w:t>
-      </w:r>
-      <w:r>
-        <w:t>72</w:t>
-      </w:r>
-      <w:r>
-        <w:t xml:space="preserve"> del </w:t>
-      </w:r>
-      <w:r>
-        <w:t>16</w:t>
-      </w:r>
-      <w:r>
-        <w:t>/</w:t>
-      </w:r>
-      <w:r>
-        <w:t>04</w:t>
-      </w:r>
-      <w:r>
-        <w:t>/20</w:t>
-      </w:r>
-      <w:r>
-        <w:t>20</w:t>
-      </w:r>
-    </w:p>
-    <w:p>
-      <w:pPr>
-        <w:pStyle w:val="Paragrafoelenco"/>
-        <w:numPr>
-          <w:ilvl w:val="0"/>
-          <w:numId w:val="48"/>
-        </w:numPr>
-      </w:pPr>
-      <w:r>
-        <w:t xml:space="preserve">Aggiunta </w:t>
-      </w:r>
-      <w:r>
-        <w:t xml:space="preserve">voce </w:t>
-      </w:r>
-      <w:r>
-        <w:t>Statistica ricavi sotto al menù STATISTICHE.</w:t>
-      </w:r>
-    </w:p>
-    <w:p>
-      <w:pPr>
-        <w:pStyle w:val="Sottotitolo"/>
-      </w:pPr>
-      <w:r>
-        <w:t>Versione 1.</w:t>
-      </w:r>
-      <w:r>
-        <w:t>71</w:t>
-      </w:r>
-      <w:r>
-        <w:t xml:space="preserve"> del </w:t>
-      </w:r>
-      <w:r>
-        <w:t>13</w:t>
-      </w:r>
-      <w:r>
-        <w:t>/</w:t>
-      </w:r>
-      <w:r>
-        <w:t>04</w:t>
-      </w:r>
-      <w:r>
-        <w:t>/20</w:t>
-      </w:r>
-      <w:r>
-        <w:t>20</w:t>
-      </w:r>
-    </w:p>
-    <w:p>
-      <w:pPr>
-        <w:pStyle w:val="Paragrafoelenco"/>
-        <w:numPr>
-          <w:ilvl w:val="0"/>
-          <w:numId w:val="48"/>
-        </w:numPr>
-      </w:pPr>
-      <w:r>
-        <w:t xml:space="preserve">Modifiche Menù, voce report </w:t>
-      </w:r>
-      <w:proofErr w:type="spellStart"/>
-      <w:r>
-        <w:t>tltime</w:t>
-      </w:r>
-      <w:proofErr w:type="spellEnd"/>
-      <w:r>
-        <w:t xml:space="preserve"> spostata sotto Report, aggiunti </w:t>
-      </w:r>
-      <w:proofErr w:type="gramStart"/>
-      <w:r>
-        <w:t>3</w:t>
-      </w:r>
-      <w:proofErr w:type="gramEnd"/>
-      <w:r>
-        <w:t xml:space="preserve"> bottoni di accesso ra</w:t>
-      </w:r>
-      <w:r>
-        <w:t xml:space="preserve">pido nel menù di destra in basso, sotto FILTRO </w:t>
-      </w:r>
-      <w:r>
-        <w:t xml:space="preserve">COLONNE </w:t>
-      </w:r>
-      <w:r>
-        <w:t>AGENDA</w:t>
-      </w:r>
-      <w:r>
-        <w:t>.</w:t>
-      </w:r>
-    </w:p>
-    <w:p>
-      <w:pPr>
-        <w:pStyle w:val="Sottotitolo"/>
-      </w:pPr>
-      <w:r>
-        <w:t>Versione 1.</w:t>
-      </w:r>
-      <w:r>
-        <w:t>70</w:t>
-      </w:r>
-      <w:r>
-        <w:t xml:space="preserve"> del </w:t>
-      </w:r>
-      <w:r>
-        <w:t>15</w:t>
-      </w:r>
-      <w:r>
-        <w:t>/</w:t>
-      </w:r>
-      <w:r>
-        <w:t>03</w:t>
-      </w:r>
-      <w:r>
-        <w:t>/20</w:t>
-      </w:r>
-      <w:r>
-        <w:t>20</w:t>
-      </w:r>
-    </w:p>
-    <w:p>
-      <w:pPr>
-        <w:pStyle w:val="Paragrafoelenco"/>
-        <w:numPr>
-          <w:ilvl w:val="0"/>
-          <w:numId w:val="47"/>
-        </w:numPr>
-      </w:pPr>
-      <w:r>
-        <w:t>Aggiornamento scadenzario</w:t>
-      </w:r>
-    </w:p>
-    <w:p>
-      <w:pPr>
-        <w:pStyle w:val="Sottotitolo"/>
-      </w:pPr>
-      <w:r>
-        <w:t>Versione 1.</w:t>
-      </w:r>
-      <w:r>
-        <w:t>69</w:t>
-      </w:r>
-      <w:r>
-        <w:t xml:space="preserve"> del </w:t>
-      </w:r>
-      <w:r>
-        <w:t>02</w:t>
-      </w:r>
-      <w:r>
-        <w:t>/</w:t>
-      </w:r>
-      <w:r>
-        <w:t>03</w:t>
-      </w:r>
-      <w:r>
-        <w:t>/20</w:t>
-      </w:r>
-      <w:r>
-        <w:t>20</w:t>
-      </w:r>
-    </w:p>
-    <w:p>
-      <w:pPr>
-        <w:pStyle w:val="Paragrafoelenco"/>
-        <w:numPr>
-          <w:ilvl w:val="0"/>
-          <w:numId w:val="46"/>
-        </w:numPr>
-      </w:pPr>
-      <w:r>
-        <w:t>Aggiunta modifica data Fattura su stampa Fattura</w:t>
-      </w:r>
-    </w:p>
-    <w:p>
-      <w:pPr>
-        <w:pStyle w:val="Sottotitolo"/>
-      </w:pPr>
-      <w:r>
-        <w:t>Versione 1.</w:t>
-      </w:r>
-      <w:r>
-        <w:t>68</w:t>
-      </w:r>
-      <w:r>
-        <w:t xml:space="preserve"> del </w:t>
-      </w:r>
-      <w:r>
-        <w:t>29</w:t>
-      </w:r>
-      <w:r>
-        <w:t>/</w:t>
-      </w:r>
-      <w:r>
-        <w:t>02</w:t>
-      </w:r>
-      <w:r>
-        <w:t>/20</w:t>
-      </w:r>
-      <w:r>
-        <w:t>20</w:t>
-      </w:r>
-    </w:p>
-    <w:p>
-      <w:pPr>
-        <w:pStyle w:val="Paragrafoelenco"/>
-        <w:numPr>
-          <w:ilvl w:val="0"/>
-          <w:numId w:val="45"/>
-        </w:numPr>
-      </w:pPr>
-      <w:r>
-        <w:t>Completata funzionalità gestione Magazzino per Lavorazione con stampa PDF</w:t>
-      </w:r>
-      <w:r>
-        <w:t xml:space="preserve"> (Tasto MAGAZZINO su pagina Lavorazione)</w:t>
-      </w:r>
-      <w:r>
-        <w:t>.</w:t>
-      </w:r>
-    </w:p>
-    <w:p>
-      <w:pPr>
-        <w:pStyle w:val="Sottotitolo"/>
-      </w:pPr>
-      <w:r>
-        <w:t>Versione 1.</w:t>
-      </w:r>
-      <w:r>
-        <w:t>67</w:t>
-      </w:r>
-      <w:r>
-        <w:t xml:space="preserve"> del </w:t>
-      </w:r>
-      <w:r>
-        <w:t>05</w:t>
-      </w:r>
-      <w:r>
-        <w:t>/</w:t>
-      </w:r>
-      <w:r>
-        <w:t>02</w:t>
-      </w:r>
-      <w:r>
-        <w:t>/20</w:t>
-      </w:r>
-      <w:r>
-        <w:t>20</w:t>
-      </w:r>
-    </w:p>
-    <w:p>
-      <w:pPr>
-        <w:pStyle w:val="Paragrafoelenco"/>
-        <w:numPr>
-          <w:ilvl w:val="0"/>
-          <w:numId w:val="44"/>
-        </w:numPr>
-      </w:pPr>
-      <w:r>
-        <w:t xml:space="preserve">Sistemazione nota spese; Aggiunta pulsante annulla per chiudere evento senza salvare; gestione import in piano esterno quando una </w:t>
-      </w:r>
-      <w:proofErr w:type="spellStart"/>
-      <w:r>
-        <w:t>fig</w:t>
-      </w:r>
-      <w:proofErr w:type="spellEnd"/>
-      <w:r>
-        <w:t xml:space="preserve"> prof viene modificata in </w:t>
-      </w:r>
-      <w:proofErr w:type="spellStart"/>
-      <w:r>
-        <w:t>dett</w:t>
-      </w:r>
-      <w:proofErr w:type="spellEnd"/>
-      <w:r>
-        <w:t xml:space="preserve"> economico</w:t>
-      </w:r>
-    </w:p>
-    <w:p>
-      <w:pPr>
-        <w:pStyle w:val="Sottotitolo"/>
-      </w:pPr>
-      <w:r>
-        <w:t>Versione 1.</w:t>
-      </w:r>
-      <w:r>
-        <w:t>66</w:t>
-      </w:r>
-      <w:r>
-        <w:t xml:space="preserve"> del </w:t>
-      </w:r>
-      <w:r>
-        <w:t>01</w:t>
-      </w:r>
-      <w:r>
-        <w:t>/</w:t>
-      </w:r>
-      <w:r>
-        <w:t>02</w:t>
-      </w:r>
-      <w:r>
-        <w:t>/20</w:t>
-      </w:r>
-      <w:r>
-        <w:t>20</w:t>
-      </w:r>
-    </w:p>
-    <w:p>
-      <w:pPr>
-        <w:pStyle w:val="Paragrafoelenco"/>
-        <w:numPr>
-          <w:ilvl w:val="0"/>
-          <w:numId w:val="43"/>
-        </w:numPr>
-      </w:pPr>
-      <w:r>
-        <w:t>Magazzino, campo gruppo dipendente da sub categoria</w:t>
-      </w:r>
-    </w:p>
-    <w:p>
-      <w:pPr>
-        <w:pStyle w:val="Paragrafoelenco"/>
-        <w:numPr>
-          <w:ilvl w:val="0"/>
-          <w:numId w:val="43"/>
-        </w:numPr>
-      </w:pPr>
-      <w:r>
-        <w:t>Nome Pdf fattura con Numero Fattura e non Codice Evento</w:t>
-      </w:r>
-    </w:p>
-    <w:p>
-      <w:pPr>
-        <w:pStyle w:val="Paragrafoelenco"/>
-        <w:numPr>
-          <w:ilvl w:val="0"/>
-          <w:numId w:val="43"/>
-        </w:numPr>
-      </w:pPr>
-      <w:r>
-        <w:t>Report collaboratori, totale in alto.</w:t>
-      </w:r>
-    </w:p>
-    <w:p>
-      <w:pPr>
-        <w:pStyle w:val="Sottotitolo"/>
-      </w:pPr>
-      <w:r>
-        <w:t>Versione 1.</w:t>
-      </w:r>
-      <w:r>
-        <w:t>65</w:t>
-      </w:r>
-      <w:r>
-        <w:t xml:space="preserve"> del </w:t>
-      </w:r>
-      <w:r>
-        <w:t>27</w:t>
-      </w:r>
-      <w:r>
-        <w:t>/</w:t>
-      </w:r>
-      <w:r>
-        <w:t>01</w:t>
-      </w:r>
-      <w:r>
-        <w:t>/20</w:t>
-      </w:r>
-      <w:r>
-        <w:t>20</w:t>
-      </w:r>
-    </w:p>
-    <w:p>
-      <w:pPr>
-        <w:pStyle w:val="Paragrafoelenco"/>
-        <w:numPr>
-          <w:ilvl w:val="0"/>
-          <w:numId w:val="42"/>
-        </w:numPr>
-      </w:pPr>
-      <w:r>
-        <w:t>Ricerca con filtro, Riepilogo e Stampa Collaboratori</w:t>
-      </w:r>
-    </w:p>
-    <w:p>
-      <w:pPr>
-        <w:pStyle w:val="Paragrafoelenco"/>
-        <w:numPr>
-          <w:ilvl w:val="0"/>
-          <w:numId w:val="42"/>
-        </w:numPr>
-      </w:pPr>
-      <w:r>
-        <w:t>Ricerca con filtro, Riepilogo e Stampa per Consulente del Lavoro</w:t>
-      </w:r>
-    </w:p>
-    <w:p>
-      <w:pPr>
-        <w:pStyle w:val="Sottotitolo"/>
-      </w:pPr>
-      <w:r>
-        <w:t>Versione 1.</w:t>
-      </w:r>
-      <w:r>
-        <w:t>64</w:t>
-      </w:r>
-      <w:r>
-        <w:t xml:space="preserve"> del </w:t>
-      </w:r>
-      <w:r>
-        <w:t>17</w:t>
-      </w:r>
-      <w:r>
-        <w:t>/</w:t>
-      </w:r>
-      <w:r>
-        <w:t>01</w:t>
-      </w:r>
-      <w:r>
-        <w:t>/20</w:t>
-      </w:r>
-      <w:r>
-        <w:t>20</w:t>
-      </w:r>
-    </w:p>
-    <w:p>
-      <w:pPr>
-        <w:pStyle w:val="Paragrafoelenco"/>
-        <w:numPr>
-          <w:ilvl w:val="0"/>
-          <w:numId w:val="41"/>
-        </w:numPr>
-      </w:pPr>
-      <w:r>
-        <w:lastRenderedPageBreak/>
-        <w:t>Modifiche visualizzazione griglia magazzino</w:t>
-      </w:r>
-    </w:p>
-    <w:p>
-      <w:pPr>
-        <w:pStyle w:val="Paragrafoelenco"/>
-        <w:numPr>
-          <w:ilvl w:val="0"/>
-          <w:numId w:val="41"/>
-        </w:numPr>
-      </w:pPr>
-      <w:r>
-        <w:t>Modifiche pagina Scadenzario con totali</w:t>
-      </w:r>
-    </w:p>
-    <w:p>
-      <w:pPr>
-        <w:pStyle w:val="Sottotitolo"/>
-      </w:pPr>
-      <w:r>
-        <w:t>Versione 1.</w:t>
-      </w:r>
-      <w:r>
-        <w:t>63</w:t>
-      </w:r>
-      <w:r>
-        <w:t xml:space="preserve"> del </w:t>
-      </w:r>
-      <w:r>
-        <w:t>15</w:t>
-      </w:r>
-      <w:r>
-        <w:t>/</w:t>
-      </w:r>
-      <w:r>
-        <w:t>01</w:t>
-      </w:r>
-      <w:r>
-        <w:t>/20</w:t>
-      </w:r>
-      <w:r>
-        <w:t>20</w:t>
-      </w:r>
-    </w:p>
-    <w:p>
-      <w:pPr>
-        <w:pStyle w:val="Paragrafoelenco"/>
-        <w:numPr>
-          <w:ilvl w:val="0"/>
-          <w:numId w:val="40"/>
-        </w:numPr>
-      </w:pPr>
-      <w:r>
-        <w:t>Campo lavorazione modificabile in fase di offerta</w:t>
-      </w:r>
-    </w:p>
-    <w:p>
-      <w:pPr>
-        <w:pStyle w:val="Paragrafoelenco"/>
-        <w:numPr>
-          <w:ilvl w:val="0"/>
-          <w:numId w:val="40"/>
-        </w:numPr>
-      </w:pPr>
-      <w:r>
-        <w:t>Campo ID non visibile su elenco protocolli</w:t>
-      </w:r>
-    </w:p>
-    <w:p>
-      <w:pPr>
-        <w:pStyle w:val="Sottotitolo"/>
-      </w:pPr>
-      <w:r>
-        <w:t>Versione 1.</w:t>
-      </w:r>
-      <w:r>
-        <w:t>62</w:t>
-      </w:r>
-      <w:r>
-        <w:t xml:space="preserve"> del </w:t>
-      </w:r>
-      <w:r>
-        <w:t>11</w:t>
-      </w:r>
-      <w:r>
-        <w:t>/</w:t>
-      </w:r>
-      <w:r>
-        <w:t>01</w:t>
-      </w:r>
-      <w:r>
-        <w:t>/20</w:t>
-      </w:r>
-      <w:r>
-        <w:t>20</w:t>
-      </w:r>
-    </w:p>
-    <w:p>
-      <w:pPr>
-        <w:pStyle w:val="Paragrafoelenco"/>
-        <w:numPr>
-          <w:ilvl w:val="0"/>
-          <w:numId w:val="39"/>
-        </w:numPr>
-      </w:pPr>
-      <w:r>
-        <w:t>Aggiustamenti pagina Magazzino</w:t>
-      </w:r>
-    </w:p>
-    <w:p>
-      <w:pPr>
-        <w:pStyle w:val="Sottotitolo"/>
-      </w:pPr>
-      <w:r>
-        <w:t>Versione 1.</w:t>
-      </w:r>
-      <w:r>
-        <w:t>61</w:t>
-      </w:r>
-      <w:r>
-        <w:t xml:space="preserve"> del </w:t>
-      </w:r>
-      <w:r>
-        <w:t>29</w:t>
-      </w:r>
-      <w:r>
-        <w:t>/</w:t>
-      </w:r>
-      <w:r>
-        <w:t>12</w:t>
-      </w:r>
-      <w:r>
-        <w:t>/2019</w:t>
-      </w:r>
-    </w:p>
-    <w:p>
-      <w:pPr>
-        <w:pStyle w:val="Paragrafoelenco"/>
-        <w:numPr>
-          <w:ilvl w:val="0"/>
-          <w:numId w:val="38"/>
-        </w:numPr>
-      </w:pPr>
-      <w:r>
-        <w:t>Magazzino: cambiato ordine campi elenco</w:t>
-      </w:r>
-    </w:p>
-    <w:p>
-      <w:pPr>
-        <w:pStyle w:val="Paragrafoelenco"/>
-        <w:numPr>
-          <w:ilvl w:val="0"/>
-          <w:numId w:val="38"/>
-        </w:numPr>
-      </w:pPr>
-      <w:r>
-        <w:t>Campi da liste a tendina ricercati per “uguale” e non per “contiene”</w:t>
-      </w:r>
-    </w:p>
-    <w:p>
-      <w:pPr>
-        <w:pStyle w:val="Paragrafoelenco"/>
-        <w:numPr>
-          <w:ilvl w:val="0"/>
-          <w:numId w:val="38"/>
-        </w:numPr>
-      </w:pPr>
-      <w:r>
-        <w:t xml:space="preserve">Stampa Fattura: distanziato il valore </w:t>
-      </w:r>
-      <w:proofErr w:type="spellStart"/>
-      <w:r>
-        <w:t>Lav.Rif</w:t>
-      </w:r>
-      <w:proofErr w:type="spellEnd"/>
-      <w:r>
-        <w:t>. dal numero fattura</w:t>
-      </w:r>
-    </w:p>
-    <w:p>
-      <w:pPr>
-        <w:pStyle w:val="Paragrafoelenco"/>
-        <w:numPr>
-          <w:ilvl w:val="0"/>
-          <w:numId w:val="38"/>
-        </w:numPr>
-      </w:pPr>
-      <w:r>
-        <w:t>Aggiunto pulsante “Magazzino” nella pagina della lavorazione per futura gestione attrezzature per lavorazione</w:t>
-      </w:r>
-    </w:p>
-    <w:p>
-      <w:pPr>
-        <w:pStyle w:val="Sottotitolo"/>
-      </w:pPr>
-      <w:r>
-        <w:t>Versione 1.</w:t>
-      </w:r>
-      <w:r>
-        <w:t>60</w:t>
-      </w:r>
-      <w:r>
-        <w:t xml:space="preserve"> del </w:t>
-      </w:r>
-      <w:r>
-        <w:t>21</w:t>
-      </w:r>
-      <w:r>
-        <w:t>/</w:t>
-      </w:r>
-      <w:r>
-        <w:t>12</w:t>
-      </w:r>
-      <w:r>
-        <w:t>/2019</w:t>
-      </w:r>
-    </w:p>
-    <w:p>
-      <w:pPr>
-        <w:pStyle w:val="Paragrafoelenco"/>
-        <w:numPr>
-          <w:ilvl w:val="0"/>
-          <w:numId w:val="37"/>
-        </w:numPr>
-      </w:pPr>
-      <w:r>
-        <w:t>Creazione Fattura in uscita, numero fattura generato in automatico in formato AAAA-NNNN, con progressivo a partire da 1 ogni cambio di anno</w:t>
-      </w:r>
-    </w:p>
-    <w:p>
-      <w:pPr>
-        <w:pStyle w:val="Paragrafoelenco"/>
-        <w:numPr>
-          <w:ilvl w:val="0"/>
-          <w:numId w:val="37"/>
-        </w:numPr>
-      </w:pPr>
-      <w:r>
-        <w:t xml:space="preserve">Modifica pdf fattura in uscita con numero fattura corretto e </w:t>
-      </w:r>
-      <w:proofErr w:type="spellStart"/>
-      <w:r>
-        <w:t>N.Rif</w:t>
-      </w:r>
-      <w:proofErr w:type="spellEnd"/>
-      <w:r>
-        <w:t>. lavorazione evidenziato accanto (N.B. il protocollo del documento di tipo fattura viene generato allo stesso modo di sempre, il numero fattura viene memorizzato ne campo Riferimento Protocollo).</w:t>
-      </w:r>
-    </w:p>
-    <w:p>
-      <w:pPr>
-        <w:pStyle w:val="Paragrafoelenco"/>
-        <w:numPr>
-          <w:ilvl w:val="0"/>
-          <w:numId w:val="37"/>
-        </w:numPr>
-      </w:pPr>
-      <w:r>
-        <w:t xml:space="preserve">Spostato a destra della griglia dei risultati il tasto di visualizzazione dettaglio protocollo </w:t>
-      </w:r>
-    </w:p>
-    <w:p>
-      <w:pPr>
-        <w:pStyle w:val="Sottotitolo"/>
-      </w:pPr>
-    </w:p>
-    <w:p>
-      <w:pPr>
-        <w:pStyle w:val="Sottotitolo"/>
-      </w:pPr>
-      <w:r>
-        <w:t>Versione 1.</w:t>
-      </w:r>
-      <w:r>
-        <w:t>59</w:t>
-      </w:r>
-      <w:r>
-        <w:t xml:space="preserve"> del </w:t>
-      </w:r>
-      <w:r>
-        <w:t>16</w:t>
-      </w:r>
-      <w:r>
-        <w:t>/</w:t>
-      </w:r>
-      <w:r>
-        <w:t>12</w:t>
-      </w:r>
-      <w:r>
-        <w:t>/2019</w:t>
-      </w:r>
-    </w:p>
-    <w:p>
-      <w:pPr>
-        <w:pStyle w:val="Paragrafoelenco"/>
-        <w:numPr>
-          <w:ilvl w:val="0"/>
-          <w:numId w:val="37"/>
-        </w:numPr>
-      </w:pPr>
-      <w:r>
-        <w:t>Aggiornamento scadenzario</w:t>
-      </w:r>
-    </w:p>
-    <w:p>
-      <w:pPr>
-        <w:pStyle w:val="Sottotitolo"/>
-      </w:pPr>
-      <w:r>
-        <w:t>Versione 1.</w:t>
-      </w:r>
-      <w:r>
-        <w:t>58</w:t>
-      </w:r>
-      <w:r>
-        <w:t xml:space="preserve"> del </w:t>
-      </w:r>
-      <w:r>
-        <w:t>10</w:t>
-      </w:r>
-      <w:r>
-        <w:t>/</w:t>
-      </w:r>
-      <w:r>
-        <w:t>12</w:t>
-      </w:r>
-      <w:r>
-        <w:t>/2019</w:t>
-      </w:r>
-    </w:p>
-    <w:p>
-      <w:pPr>
-        <w:pStyle w:val="Paragrafoelenco"/>
-        <w:numPr>
-          <w:ilvl w:val="0"/>
-          <w:numId w:val="37"/>
-        </w:numPr>
-      </w:pPr>
-      <w:r>
-        <w:t>Aggiunta scadenzario</w:t>
-      </w:r>
-    </w:p>
-    <w:p>
-      <w:pPr>
-        <w:pStyle w:val="Sottotitolo"/>
-      </w:pPr>
-      <w:r>
-        <w:t>Versione 1.</w:t>
-      </w:r>
-      <w:r>
-        <w:t>57</w:t>
-      </w:r>
-      <w:r>
-        <w:t xml:space="preserve"> del </w:t>
-      </w:r>
-      <w:r>
-        <w:t>07</w:t>
-      </w:r>
-      <w:r>
-        <w:t>/</w:t>
-      </w:r>
-      <w:r>
-        <w:t>12</w:t>
-      </w:r>
-      <w:r>
-        <w:t>/2019</w:t>
-      </w:r>
-    </w:p>
-    <w:p>
-      <w:pPr>
-        <w:pStyle w:val="Paragrafoelenco"/>
-        <w:numPr>
-          <w:ilvl w:val="0"/>
-          <w:numId w:val="37"/>
-        </w:numPr>
-      </w:pPr>
-      <w:r>
-        <w:t>Ricerca protocolli per range di date</w:t>
-      </w:r>
-    </w:p>
-    <w:p>
-      <w:pPr>
-        <w:pStyle w:val="Sottotitolo"/>
-      </w:pPr>
-    </w:p>
-    <w:p>
-      <w:pPr>
-        <w:pStyle w:val="Sottotitolo"/>
-      </w:pPr>
-      <w:r>
-        <w:t>Versione 1.</w:t>
-      </w:r>
-      <w:r>
-        <w:t>56</w:t>
-      </w:r>
-      <w:r>
-        <w:t xml:space="preserve"> del </w:t>
-      </w:r>
-      <w:r>
-        <w:t>29</w:t>
-      </w:r>
-      <w:r>
-        <w:t>/</w:t>
-      </w:r>
-      <w:r>
-        <w:t>11</w:t>
-      </w:r>
-      <w:r>
-        <w:t>/2019</w:t>
-      </w:r>
-    </w:p>
-    <w:p>
-      <w:pPr>
-        <w:pStyle w:val="Paragrafoelenco"/>
-        <w:numPr>
-          <w:ilvl w:val="0"/>
-          <w:numId w:val="37"/>
-        </w:numPr>
-      </w:pPr>
-      <w:r>
-        <w:t xml:space="preserve">Aggiunta voce creazione file </w:t>
-      </w:r>
-      <w:proofErr w:type="spellStart"/>
-      <w:r>
-        <w:t>TLTime</w:t>
-      </w:r>
-      <w:proofErr w:type="spellEnd"/>
-    </w:p>
-    <w:p>
-      <w:pPr>
-        <w:pStyle w:val="Sottotitolo"/>
-      </w:pPr>
-      <w:r>
-        <w:t>Versione 1.</w:t>
-      </w:r>
-      <w:r>
-        <w:t>55</w:t>
-      </w:r>
-      <w:r>
-        <w:t xml:space="preserve"> del </w:t>
-      </w:r>
-      <w:r>
-        <w:t>27</w:t>
-      </w:r>
-      <w:r>
-        <w:t>/</w:t>
-      </w:r>
-      <w:r>
-        <w:t>11</w:t>
-      </w:r>
-      <w:r>
-        <w:t>/2019</w:t>
+        <w:t>Protocollo: aggiunti campi “pregresso” di tipo vero/falso e “des</w:t>
+      </w:r>
+      <w:r>
+        <w:t>00</w:t>
+      </w:r>
+      <w:r>
+        <w:t>tinatario” che assume i valori cliente o fornitore</w:t>
       </w:r>
     </w:p>
     <w:p>
@@ -3368,49 +3439,6 @@
         </w:numPr>
       </w:pPr>
       <w:r>
-        <w:t>Stampa Piano Esterno: numeri di telefono senza prefisso internazionale</w:t>
-      </w:r>
-    </w:p>
-    <w:p>
-      <w:pPr>
-        <w:pStyle w:val="Paragrafoelenco"/>
-        <w:numPr>
-          <w:ilvl w:val="0"/>
-          <w:numId w:val="36"/>
-        </w:numPr>
-      </w:pPr>
-      <w:r>
-        <w:t>Stampa Piano Esterno: divisione tra date differenti (aggiunta riga vuota di separazione)</w:t>
-      </w:r>
-    </w:p>
-    <w:p>
-      <w:pPr>
-        <w:pStyle w:val="Paragrafoelenco"/>
-        <w:numPr>
-          <w:ilvl w:val="0"/>
-          <w:numId w:val="36"/>
-        </w:numPr>
-      </w:pPr>
-      <w:r>
-        <w:t>Protocollo: aggiunti campi “pregresso” di tipo vero/falso e “des</w:t>
-      </w:r>
-      <w:r>
-        <w:t>00</w:t>
-      </w:r>
-      <w:r>
-        <w:t>tinatario” che assume i valori cliente o fornitore</w:t>
-      </w:r>
-    </w:p>
-    <w:p>
-      <w:pPr>
-        <w:pStyle w:val="Paragrafoelenco"/>
-        <w:numPr>
-          <w:ilvl w:val="0"/>
-          <w:numId w:val="36"/>
-        </w:numPr>
-      </w:pPr>
-      <w:r>
-        <w:lastRenderedPageBreak/>
         <w:t>Aggiunta stampa Fattura in uscita (viene creato il relativo protocollo di tipo “fattura” manca l’inserimento nello scadenzario)</w:t>
       </w:r>
     </w:p>
@@ -3906,6 +3934,7 @@
         </w:numPr>
       </w:pPr>
       <w:r>
+        <w:lastRenderedPageBreak/>
         <w:t>possibilità di modificare alcuni dati appuntamento anche se un evento è in lavorazione</w:t>
       </w:r>
     </w:p>
@@ -3918,7 +3947,6 @@
         </w:numPr>
       </w:pPr>
       <w:r>
-        <w:lastRenderedPageBreak/>
         <w:t>replica per ogni giorno di lavorazi</w:t>
       </w:r>
       <w:r>

</xml_diff>